<commit_message>
feat(templates): print the knowledge tests from the question bank and test results on the SSM sheet
The three tests (5.1, 4.1, 4.2) are built from tools/import/tests.ro.json by build_tests.py and loop over `questions`, on the test, the answer sheet, the specimen and the key; 5.1 loses its pictogram question and pictures, and all three print the 70% line. The SSM sheet's test block loops over `testResults` with blank rows to five, and on the signed sheet has field rows t1 to t5. The tests' citations leave citations.json with their questions.
</commit_message>
<xml_diff>
--- a/packages/document-engine/templates/fisa_instruire_ssm.docx
+++ b/packages/document-engine/templates/fisa_instruire_ssm.docx
@@ -44812,6 +44812,43 @@
         <w:t xml:space="preserve">Rezultatele testărilor</w:t>
       </w:r>
     </w:p>
+    <w:p>
+      <w:pPr>
+        <w:pStyle w:val="Normal"/>
+        <w:keepNext w:val="false"/>
+        <w:pageBreakBefore w:val="false"/>
+        <w:widowControl/>
+        <w:bidi w:val="0"/>
+        <w:spacing w:before="0" w:after="0"/>
+        <w:ind w:hanging="0" w:left="0"/>
+        <w:jc w:val="left"/>
+        <w:rPr>
+          <w:rFonts w:eastAsia="Arial" w:cs="Arial" w:ascii="Arial" w:hAnsi="Arial"/>
+          <w:b w:val="false"/>
+          <w:i w:val="false"/>
+          <w:color w:val="auto"/>
+          <w:spacing w:val="0"/>
+          <w:w w:val="100"/>
+          <w:sz w:val="20"/>
+          <w:szCs w:val="20"/>
+          <w:lang w:val="ro-RO"/>
+        </w:rPr>
+      </w:pPr>
+      <w:r>
+        <w:rPr>
+          <w:rFonts w:eastAsia="Arial" w:cs="Arial" w:ascii="Arial" w:hAnsi="Arial"/>
+          <w:b w:val="false"/>
+          <w:i w:val="false"/>
+          <w:color w:val="auto"/>
+          <w:spacing w:val="0"/>
+          <w:w w:val="100"/>
+          <w:sz w:val="20"/>
+          <w:szCs w:val="20"/>
+          <w:lang w:val="ro-RO"/>
+        </w:rPr>
+        <w:t xml:space="preserve">{{^form.on}}</w:t>
+      </w:r>
+    </w:p>
     <w:tbl>
       <w:tblPr>
         <w:tblW w:w="5000" w:type="pct"/>
@@ -45071,6 +45108,20 @@
                 <w:lang w:val="ro-RO"/>
               </w:rPr>
             </w:pPr>
+            <w:r>
+              <w:rPr>
+                <w:rFonts w:eastAsia="Arial" w:cs="Arial" w:ascii="Arial" w:hAnsi="Arial"/>
+                <w:b w:val="false"/>
+                <w:i w:val="false"/>
+                <w:color w:val="auto"/>
+                <w:spacing w:val="0"/>
+                <w:w w:val="100"/>
+                <w:sz w:val="16"/>
+                <w:szCs w:val="16"/>
+                <w:lang w:val="ro-RO"/>
+              </w:rPr>
+              <w:t xml:space="preserve">{{#testResults}}{{date}}</w:t>
+            </w:r>
           </w:p>
         </w:tc>
         <w:tc>
@@ -45106,6 +45157,20 @@
                 <w:lang w:val="ro-RO"/>
               </w:rPr>
             </w:pPr>
+            <w:r>
+              <w:rPr>
+                <w:rFonts w:eastAsia="Arial" w:cs="Arial" w:ascii="Arial" w:hAnsi="Arial"/>
+                <w:b w:val="false"/>
+                <w:i w:val="false"/>
+                <w:color w:val="auto"/>
+                <w:spacing w:val="0"/>
+                <w:w w:val="100"/>
+                <w:sz w:val="16"/>
+                <w:szCs w:val="16"/>
+                <w:lang w:val="ro-RO"/>
+              </w:rPr>
+              <w:t xml:space="preserve">{{material}}</w:t>
+            </w:r>
           </w:p>
         </w:tc>
         <w:tc>
@@ -45141,6 +45206,20 @@
                 <w:lang w:val="ro-RO"/>
               </w:rPr>
             </w:pPr>
+            <w:r>
+              <w:rPr>
+                <w:rFonts w:eastAsia="Arial" w:cs="Arial" w:ascii="Arial" w:hAnsi="Arial"/>
+                <w:b w:val="false"/>
+                <w:i w:val="false"/>
+                <w:color w:val="auto"/>
+                <w:spacing w:val="0"/>
+                <w:w w:val="100"/>
+                <w:sz w:val="16"/>
+                <w:szCs w:val="16"/>
+                <w:lang w:val="ro-RO"/>
+              </w:rPr>
+              <w:t xml:space="preserve">{{grade}}</w:t>
+            </w:r>
           </w:p>
         </w:tc>
         <w:tc>
@@ -45176,6 +45255,20 @@
                 <w:lang w:val="ro-RO"/>
               </w:rPr>
             </w:pPr>
+            <w:r>
+              <w:rPr>
+                <w:rFonts w:eastAsia="Arial" w:cs="Arial" w:ascii="Arial" w:hAnsi="Arial"/>
+                <w:b w:val="false"/>
+                <w:i w:val="false"/>
+                <w:color w:val="auto"/>
+                <w:spacing w:val="0"/>
+                <w:w w:val="100"/>
+                <w:sz w:val="16"/>
+                <w:szCs w:val="16"/>
+                <w:lang w:val="ro-RO"/>
+              </w:rPr>
+              <w:t xml:space="preserve">{{examiner}}{{/testResults}}</w:t>
+            </w:r>
           </w:p>
         </w:tc>
       </w:tr>
@@ -45217,6 +45310,20 @@
                 <w:lang w:val="ro-RO"/>
               </w:rPr>
             </w:pPr>
+            <w:r>
+              <w:rPr>
+                <w:rFonts w:eastAsia="Arial" w:cs="Arial" w:ascii="Arial" w:hAnsi="Arial"/>
+                <w:b w:val="false"/>
+                <w:i w:val="false"/>
+                <w:color w:val="auto"/>
+                <w:spacing w:val="0"/>
+                <w:w w:val="100"/>
+                <w:sz w:val="16"/>
+                <w:szCs w:val="16"/>
+                <w:lang w:val="ro-RO"/>
+              </w:rPr>
+              <w:t xml:space="preserve">{{#blankRows.testResults}}</w:t>
+            </w:r>
           </w:p>
         </w:tc>
         <w:tc>
@@ -45322,6 +45429,316 @@
                 <w:lang w:val="ro-RO"/>
               </w:rPr>
             </w:pPr>
+            <w:r>
+              <w:rPr>
+                <w:rFonts w:eastAsia="Arial" w:cs="Arial" w:ascii="Arial" w:hAnsi="Arial"/>
+                <w:b w:val="false"/>
+                <w:i w:val="false"/>
+                <w:color w:val="auto"/>
+                <w:spacing w:val="0"/>
+                <w:w w:val="100"/>
+                <w:sz w:val="16"/>
+                <w:szCs w:val="16"/>
+                <w:lang w:val="ro-RO"/>
+              </w:rPr>
+              <w:t xml:space="preserve">{{/blankRows.testResults}}</w:t>
+            </w:r>
+          </w:p>
+        </w:tc>
+      </w:tr>
+    </w:tbl>
+    <w:p>
+      <w:pPr>
+        <w:pStyle w:val="Normal"/>
+        <w:keepNext w:val="false"/>
+        <w:pageBreakBefore w:val="false"/>
+        <w:widowControl/>
+        <w:bidi w:val="0"/>
+        <w:spacing w:before="0" w:after="0"/>
+        <w:ind w:hanging="0" w:left="0"/>
+        <w:jc w:val="left"/>
+        <w:rPr>
+          <w:rFonts w:eastAsia="Arial" w:cs="Arial" w:ascii="Arial" w:hAnsi="Arial"/>
+          <w:b w:val="false"/>
+          <w:i w:val="false"/>
+          <w:color w:val="auto"/>
+          <w:spacing w:val="0"/>
+          <w:w w:val="100"/>
+          <w:sz w:val="20"/>
+          <w:szCs w:val="20"/>
+          <w:lang w:val="ro-RO"/>
+        </w:rPr>
+      </w:pPr>
+      <w:r>
+        <w:rPr>
+          <w:rFonts w:eastAsia="Arial" w:cs="Arial" w:ascii="Arial" w:hAnsi="Arial"/>
+          <w:b w:val="false"/>
+          <w:i w:val="false"/>
+          <w:color w:val="auto"/>
+          <w:spacing w:val="0"/>
+          <w:w w:val="100"/>
+          <w:sz w:val="20"/>
+          <w:szCs w:val="20"/>
+          <w:lang w:val="ro-RO"/>
+        </w:rPr>
+        <w:t xml:space="preserve">{{/form.on}}</w:t>
+      </w:r>
+    </w:p>
+    <w:p>
+      <w:pPr>
+        <w:pStyle w:val="Normal"/>
+        <w:keepNext w:val="false"/>
+        <w:pageBreakBefore w:val="false"/>
+        <w:widowControl/>
+        <w:bidi w:val="0"/>
+        <w:spacing w:before="0" w:after="0"/>
+        <w:ind w:hanging="0" w:left="0"/>
+        <w:jc w:val="left"/>
+        <w:rPr>
+          <w:rFonts w:eastAsia="Arial" w:cs="Arial" w:ascii="Arial" w:hAnsi="Arial"/>
+          <w:b w:val="false"/>
+          <w:i w:val="false"/>
+          <w:color w:val="auto"/>
+          <w:spacing w:val="0"/>
+          <w:w w:val="100"/>
+          <w:sz w:val="20"/>
+          <w:szCs w:val="20"/>
+          <w:lang w:val="ro-RO"/>
+        </w:rPr>
+      </w:pPr>
+      <w:r>
+        <w:rPr>
+          <w:rFonts w:eastAsia="Arial" w:cs="Arial" w:ascii="Arial" w:hAnsi="Arial"/>
+          <w:b w:val="false"/>
+          <w:i w:val="false"/>
+          <w:color w:val="auto"/>
+          <w:spacing w:val="0"/>
+          <w:w w:val="100"/>
+          <w:sz w:val="20"/>
+          <w:szCs w:val="20"/>
+          <w:lang w:val="ro-RO"/>
+        </w:rPr>
+        <w:t xml:space="preserve">{{#form.on}}</w:t>
+      </w:r>
+    </w:p>
+    <w:tbl>
+      <w:tblPr>
+        <w:tblW w:w="5000" w:type="pct"/>
+        <w:jc w:val="left"/>
+        <w:tblInd w:w="0" w:type="dxa"/>
+        <w:tblLayout w:type="fixed"/>
+        <w:tblCellMar>
+          <w:top w:w="40" w:type="dxa"/>
+          <w:left w:w="55" w:type="dxa"/>
+          <w:bottom w:w="40" w:type="dxa"/>
+          <w:right w:w="55" w:type="dxa"/>
+        </w:tblCellMar>
+      </w:tblPr>
+      <w:tblGrid>
+        <w:gridCol w:w="1500"/>
+        <w:gridCol w:w="3955"/>
+        <w:gridCol w:w="1700"/>
+        <w:gridCol w:w="2200"/>
+      </w:tblGrid>
+      <w:tr>
+        <w:trPr>
+          <w:cantSplit/>
+          <w:tblHeader/>
+        </w:trPr>
+        <w:tc>
+          <w:tcPr>
+            <w:tcW w:w="1500" w:type="dxa"/>
+            <w:tcBorders>
+              <w:top w:val="single" w:sz="4" w:space="0" w:color="000000"/>
+              <w:left w:val="single" w:sz="4" w:space="0" w:color="000000"/>
+              <w:bottom w:val="single" w:sz="4" w:space="0" w:color="000000"/>
+              <w:right w:val="single" w:sz="4" w:space="0" w:color="000000"/>
+            </w:tcBorders>
+            <w:vAlign w:val="center"/>
+          </w:tcPr>
+          <w:p>
+            <w:pPr>
+              <w:pStyle w:val="TableContents"/>
+              <w:keepNext w:val="false"/>
+              <w:pageBreakBefore w:val="false"/>
+              <w:widowControl/>
+              <w:bidi w:val="0"/>
+              <w:spacing w:before="0" w:after="0"/>
+              <w:ind w:hanging="0" w:left="0"/>
+              <w:jc w:val="center"/>
+              <w:rPr>
+                <w:rFonts w:eastAsia="Arial" w:cs="Arial" w:ascii="Arial" w:hAnsi="Arial"/>
+                <w:b/>
+                <w:i w:val="false"/>
+                <w:color w:val="auto"/>
+                <w:spacing w:val="0"/>
+                <w:w w:val="100"/>
+                <w:sz w:val="16"/>
+                <w:szCs w:val="16"/>
+                <w:lang w:val="ro-RO"/>
+              </w:rPr>
+            </w:pPr>
+            <w:r>
+              <w:rPr>
+                <w:rFonts w:eastAsia="Arial" w:cs="Arial" w:ascii="Arial" w:hAnsi="Arial"/>
+                <w:b/>
+                <w:i w:val="false"/>
+                <w:color w:val="auto"/>
+                <w:spacing w:val="0"/>
+                <w:w w:val="100"/>
+                <w:sz w:val="16"/>
+                <w:szCs w:val="16"/>
+                <w:lang w:val="ro-RO"/>
+              </w:rPr>
+              <w:t xml:space="preserve">Data</w:t>
+            </w:r>
+          </w:p>
+        </w:tc>
+        <w:tc>
+          <w:tcPr>
+            <w:tcW w:w="3955" w:type="dxa"/>
+            <w:tcBorders>
+              <w:top w:val="single" w:sz="4" w:space="0" w:color="000000"/>
+              <w:left w:val="single" w:sz="4" w:space="0" w:color="000000"/>
+              <w:bottom w:val="single" w:sz="4" w:space="0" w:color="000000"/>
+              <w:right w:val="single" w:sz="4" w:space="0" w:color="000000"/>
+            </w:tcBorders>
+            <w:vAlign w:val="center"/>
+          </w:tcPr>
+          <w:p>
+            <w:pPr>
+              <w:pStyle w:val="TableContents"/>
+              <w:keepNext w:val="false"/>
+              <w:pageBreakBefore w:val="false"/>
+              <w:widowControl/>
+              <w:bidi w:val="0"/>
+              <w:spacing w:before="0" w:after="0"/>
+              <w:ind w:hanging="0" w:left="0"/>
+              <w:jc w:val="center"/>
+              <w:rPr>
+                <w:rFonts w:eastAsia="Arial" w:cs="Arial" w:ascii="Arial" w:hAnsi="Arial"/>
+                <w:b/>
+                <w:i w:val="false"/>
+                <w:color w:val="auto"/>
+                <w:spacing w:val="0"/>
+                <w:w w:val="100"/>
+                <w:sz w:val="16"/>
+                <w:szCs w:val="16"/>
+                <w:lang w:val="ro-RO"/>
+              </w:rPr>
+            </w:pPr>
+            <w:r>
+              <w:rPr>
+                <w:rFonts w:eastAsia="Arial" w:cs="Arial" w:ascii="Arial" w:hAnsi="Arial"/>
+                <w:b/>
+                <w:i w:val="false"/>
+                <w:color w:val="auto"/>
+                <w:spacing w:val="0"/>
+                <w:w w:val="100"/>
+                <w:sz w:val="16"/>
+                <w:szCs w:val="16"/>
+                <w:lang w:val="ro-RO"/>
+              </w:rPr>
+              <w:t xml:space="preserve">Materialul examinat</w:t>
+            </w:r>
+          </w:p>
+        </w:tc>
+        <w:tc>
+          <w:tcPr>
+            <w:tcW w:w="1700" w:type="dxa"/>
+            <w:tcBorders>
+              <w:top w:val="single" w:sz="4" w:space="0" w:color="000000"/>
+              <w:left w:val="single" w:sz="4" w:space="0" w:color="000000"/>
+              <w:bottom w:val="single" w:sz="4" w:space="0" w:color="000000"/>
+              <w:right w:val="single" w:sz="4" w:space="0" w:color="000000"/>
+            </w:tcBorders>
+            <w:vAlign w:val="center"/>
+          </w:tcPr>
+          <w:p>
+            <w:pPr>
+              <w:pStyle w:val="TableContents"/>
+              <w:keepNext w:val="false"/>
+              <w:pageBreakBefore w:val="false"/>
+              <w:widowControl/>
+              <w:bidi w:val="0"/>
+              <w:spacing w:before="0" w:after="0"/>
+              <w:ind w:hanging="0" w:left="0"/>
+              <w:jc w:val="center"/>
+              <w:rPr>
+                <w:rFonts w:eastAsia="Arial" w:cs="Arial" w:ascii="Arial" w:hAnsi="Arial"/>
+                <w:b/>
+                <w:i w:val="false"/>
+                <w:color w:val="auto"/>
+                <w:spacing w:val="0"/>
+                <w:w w:val="100"/>
+                <w:sz w:val="16"/>
+                <w:szCs w:val="16"/>
+                <w:lang w:val="ro-RO"/>
+              </w:rPr>
+            </w:pPr>
+            <w:r>
+              <w:rPr>
+                <w:rFonts w:eastAsia="Arial" w:cs="Arial" w:ascii="Arial" w:hAnsi="Arial"/>
+                <w:b/>
+                <w:i w:val="false"/>
+                <w:color w:val="auto"/>
+                <w:spacing w:val="0"/>
+                <w:w w:val="100"/>
+                <w:sz w:val="16"/>
+                <w:szCs w:val="16"/>
+                <w:lang w:val="ro-RO"/>
+              </w:rPr>
+              <w:t xml:space="preserve">Calificativ</w:t>
+            </w:r>
+          </w:p>
+        </w:tc>
+        <w:tc>
+          <w:tcPr>
+            <w:tcW w:w="2200" w:type="dxa"/>
+            <w:tcBorders>
+              <w:top w:val="single" w:sz="4" w:space="0" w:color="000000"/>
+              <w:left w:val="single" w:sz="4" w:space="0" w:color="000000"/>
+              <w:bottom w:val="single" w:sz="4" w:space="0" w:color="000000"/>
+              <w:right w:val="single" w:sz="4" w:space="0" w:color="000000"/>
+            </w:tcBorders>
+            <w:vAlign w:val="center"/>
+          </w:tcPr>
+          <w:p>
+            <w:pPr>
+              <w:pStyle w:val="TableContents"/>
+              <w:keepNext w:val="false"/>
+              <w:pageBreakBefore w:val="false"/>
+              <w:widowControl/>
+              <w:bidi w:val="0"/>
+              <w:spacing w:before="0" w:after="0"/>
+              <w:ind w:hanging="0" w:left="0"/>
+              <w:jc w:val="center"/>
+              <w:rPr>
+                <w:rFonts w:eastAsia="Arial" w:cs="Arial" w:ascii="Arial" w:hAnsi="Arial"/>
+                <w:b/>
+                <w:i w:val="false"/>
+                <w:color w:val="auto"/>
+                <w:spacing w:val="0"/>
+                <w:w w:val="100"/>
+                <w:sz w:val="16"/>
+                <w:szCs w:val="16"/>
+                <w:lang w:val="ro-RO"/>
+              </w:rPr>
+            </w:pPr>
+            <w:r>
+              <w:rPr>
+                <w:rFonts w:eastAsia="Arial" w:cs="Arial" w:ascii="Arial" w:hAnsi="Arial"/>
+                <w:b/>
+                <w:i w:val="false"/>
+                <w:color w:val="auto"/>
+                <w:spacing w:val="0"/>
+                <w:w w:val="100"/>
+                <w:sz w:val="16"/>
+                <w:szCs w:val="16"/>
+                <w:lang w:val="ro-RO"/>
+              </w:rPr>
+              <w:t xml:space="preserve">Examinator</w:t>
+            </w:r>
           </w:p>
         </w:tc>
       </w:tr>
@@ -45363,6 +45780,20 @@
                 <w:lang w:val="ro-RO"/>
               </w:rPr>
             </w:pPr>
+            <w:r>
+              <w:rPr>
+                <w:rFonts w:eastAsia="Arial" w:cs="Arial" w:ascii="Arial" w:hAnsi="Arial"/>
+                <w:b w:val="false"/>
+                <w:i w:val="false"/>
+                <w:color w:val="auto"/>
+                <w:spacing w:val="0"/>
+                <w:w w:val="100"/>
+                <w:sz w:val="16"/>
+                <w:szCs w:val="16"/>
+                <w:lang w:val="ro-RO"/>
+              </w:rPr>
+              <w:t xml:space="preserve">{{#testResults}}{{date}}</w:t>
+            </w:r>
           </w:p>
         </w:tc>
         <w:tc>
@@ -45398,6 +45829,20 @@
                 <w:lang w:val="ro-RO"/>
               </w:rPr>
             </w:pPr>
+            <w:r>
+              <w:rPr>
+                <w:rFonts w:eastAsia="Arial" w:cs="Arial" w:ascii="Arial" w:hAnsi="Arial"/>
+                <w:b w:val="false"/>
+                <w:i w:val="false"/>
+                <w:color w:val="auto"/>
+                <w:spacing w:val="0"/>
+                <w:w w:val="100"/>
+                <w:sz w:val="16"/>
+                <w:szCs w:val="16"/>
+                <w:lang w:val="ro-RO"/>
+              </w:rPr>
+              <w:t xml:space="preserve">{{material}}</w:t>
+            </w:r>
           </w:p>
         </w:tc>
         <w:tc>
@@ -45433,6 +45878,20 @@
                 <w:lang w:val="ro-RO"/>
               </w:rPr>
             </w:pPr>
+            <w:r>
+              <w:rPr>
+                <w:rFonts w:eastAsia="Arial" w:cs="Arial" w:ascii="Arial" w:hAnsi="Arial"/>
+                <w:b w:val="false"/>
+                <w:i w:val="false"/>
+                <w:color w:val="auto"/>
+                <w:spacing w:val="0"/>
+                <w:w w:val="100"/>
+                <w:sz w:val="16"/>
+                <w:szCs w:val="16"/>
+                <w:lang w:val="ro-RO"/>
+              </w:rPr>
+              <w:t xml:space="preserve">{{grade}}</w:t>
+            </w:r>
           </w:p>
         </w:tc>
         <w:tc>
@@ -45468,13 +45927,27 @@
                 <w:lang w:val="ro-RO"/>
               </w:rPr>
             </w:pPr>
+            <w:r>
+              <w:rPr>
+                <w:rFonts w:eastAsia="Arial" w:cs="Arial" w:ascii="Arial" w:hAnsi="Arial"/>
+                <w:b w:val="false"/>
+                <w:i w:val="false"/>
+                <w:color w:val="auto"/>
+                <w:spacing w:val="0"/>
+                <w:w w:val="100"/>
+                <w:sz w:val="16"/>
+                <w:szCs w:val="16"/>
+                <w:lang w:val="ro-RO"/>
+              </w:rPr>
+              <w:t xml:space="preserve">{{examiner}}{{/testResults}}</w:t>
+            </w:r>
           </w:p>
         </w:tc>
       </w:tr>
       <w:tr>
         <w:trPr>
           <w:cantSplit/>
-          <w:trHeight w:val="480" w:hRule="atLeast"/>
+          <w:trHeight w:val="680" w:hRule="atLeast"/>
         </w:trPr>
         <w:tc>
           <w:tcPr>
@@ -45509,6 +45982,115 @@
                 <w:lang w:val="ro-RO"/>
               </w:rPr>
             </w:pPr>
+            <w:r>
+              <w:rPr>
+                <w:rFonts w:eastAsia="Arial" w:cs="Arial" w:ascii="Arial" w:hAnsi="Arial"/>
+                <w:b w:val="false"/>
+                <w:i w:val="false"/>
+                <w:color w:val="auto"/>
+                <w:spacing w:val="0"/>
+                <w:w w:val="100"/>
+                <w:sz w:val="16"/>
+                <w:szCs w:val="16"/>
+                <w:lang w:val="ro-RO"/>
+              </w:rPr>
+              <w:t xml:space="preserve">{{#form.rows.t1}}</w:t>
+            </w:r>
+            <w:sdt>
+              <w:sdtPr>
+                <w:rPr>
+                  <w:rFonts w:eastAsia="Arial" w:cs="Arial" w:ascii="Arial" w:hAnsi="Arial"/>
+                  <w:b w:val="false"/>
+                  <w:i w:val="false"/>
+                  <w:color w:val="auto"/>
+                  <w:spacing w:val="0"/>
+                  <w:w w:val="100"/>
+                  <w:sz w:val="16"/>
+                  <w:szCs w:val="16"/>
+                  <w:lang w:val="ro-RO"/>
+                </w:rPr>
+                <w:alias w:val="t1_date"/>
+                <w:tag w:val="t1_date"/>
+                <w:id w:val="296"/>
+                <w:showingPlcHdr/>
+                <w:text/>
+              </w:sdtPr>
+              <w:sdtContent>
+                <w:r>
+                  <w:rPr>
+                    <w:rFonts w:eastAsia="Arial" w:cs="Arial" w:ascii="Arial" w:hAnsi="Arial"/>
+                    <w:b w:val="false"/>
+                    <w:i w:val="false"/>
+                    <w:color w:val="auto"/>
+                    <w:spacing w:val="0"/>
+                    <w:w w:val="100"/>
+                    <w:sz w:val="16"/>
+                    <w:szCs w:val="16"/>
+                    <w:lang w:val="ro-RO"/>
+                  </w:rPr>
+                  <w:t xml:space="preserve">                </w:t>
+                </w:r>
+              </w:sdtContent>
+            </w:sdt>
+          </w:p>
+          <w:p>
+            <w:pPr>
+              <w:pStyle w:val="TableContents"/>
+              <w:keepNext w:val="false"/>
+              <w:pageBreakBefore w:val="false"/>
+              <w:widowControl/>
+              <w:bidi w:val="0"/>
+              <w:spacing w:before="0" w:after="0"/>
+              <w:ind w:hanging="0" w:left="0"/>
+              <w:jc w:val="left"/>
+              <w:rPr>
+                <w:rFonts w:eastAsia="Arial" w:cs="Arial" w:ascii="Arial" w:hAnsi="Arial"/>
+                <w:b w:val="false"/>
+                <w:i w:val="false"/>
+                <w:color w:val="auto"/>
+                <w:spacing w:val="0"/>
+                <w:w w:val="100"/>
+                <w:sz w:val="16"/>
+                <w:szCs w:val="16"/>
+                <w:lang w:val="ro-RO"/>
+              </w:rPr>
+            </w:pPr>
+            <w:sdt>
+              <w:sdtPr>
+                <w:rPr>
+                  <w:rFonts w:eastAsia="Arial" w:cs="Arial" w:ascii="Arial" w:hAnsi="Arial"/>
+                  <w:b w:val="false"/>
+                  <w:i w:val="false"/>
+                  <w:color w:val="auto"/>
+                  <w:spacing w:val="0"/>
+                  <w:w w:val="100"/>
+                  <w:sz w:val="16"/>
+                  <w:szCs w:val="16"/>
+                  <w:lang w:val="ro-RO"/>
+                </w:rPr>
+                <w:alias w:val="t1_note"/>
+                <w:tag w:val="t1_note"/>
+                <w:id w:val="297"/>
+                <w:showingPlcHdr/>
+                <w:text/>
+              </w:sdtPr>
+              <w:sdtContent>
+                <w:r>
+                  <w:rPr>
+                    <w:rFonts w:eastAsia="Arial" w:cs="Arial" w:ascii="Arial" w:hAnsi="Arial"/>
+                    <w:b w:val="false"/>
+                    <w:i w:val="false"/>
+                    <w:color w:val="auto"/>
+                    <w:spacing w:val="0"/>
+                    <w:w w:val="100"/>
+                    <w:sz w:val="16"/>
+                    <w:szCs w:val="16"/>
+                    <w:lang w:val="ro-RO"/>
+                  </w:rPr>
+                  <w:t xml:space="preserve">                </w:t>
+                </w:r>
+              </w:sdtContent>
+            </w:sdt>
           </w:p>
         </w:tc>
         <w:tc>
@@ -45544,6 +46126,98 @@
                 <w:lang w:val="ro-RO"/>
               </w:rPr>
             </w:pPr>
+            <w:sdt>
+              <w:sdtPr>
+                <w:rPr>
+                  <w:rFonts w:eastAsia="Arial" w:cs="Arial" w:ascii="Arial" w:hAnsi="Arial"/>
+                  <w:b w:val="false"/>
+                  <w:i w:val="false"/>
+                  <w:color w:val="auto"/>
+                  <w:spacing w:val="0"/>
+                  <w:w w:val="100"/>
+                  <w:sz w:val="16"/>
+                  <w:szCs w:val="16"/>
+                  <w:lang w:val="ro-RO"/>
+                </w:rPr>
+                <w:alias w:val="t1_material"/>
+                <w:tag w:val="t1_material"/>
+                <w:id w:val="298"/>
+                <w:showingPlcHdr/>
+                <w:text w:multiLine="1"/>
+              </w:sdtPr>
+              <w:sdtContent>
+                <w:r>
+                  <w:rPr>
+                    <w:rFonts w:eastAsia="Arial" w:cs="Arial" w:ascii="Arial" w:hAnsi="Arial"/>
+                    <w:b w:val="false"/>
+                    <w:i w:val="false"/>
+                    <w:color w:val="auto"/>
+                    <w:spacing w:val="0"/>
+                    <w:w w:val="100"/>
+                    <w:sz w:val="16"/>
+                    <w:szCs w:val="16"/>
+                    <w:lang w:val="ro-RO"/>
+                  </w:rPr>
+                  <w:t xml:space="preserve">                                               </w:t>
+                </w:r>
+                <w:r>
+                  <w:rPr>
+                    <w:rFonts w:eastAsia="Arial" w:cs="Arial" w:ascii="Arial" w:hAnsi="Arial"/>
+                    <w:b w:val="false"/>
+                    <w:i w:val="false"/>
+                    <w:color w:val="auto"/>
+                    <w:spacing w:val="0"/>
+                    <w:w w:val="100"/>
+                    <w:sz w:val="16"/>
+                    <w:szCs w:val="16"/>
+                    <w:lang w:val="ro-RO"/>
+                  </w:rPr>
+                  <w:br/>
+                </w:r>
+                <w:r>
+                  <w:rPr>
+                    <w:rFonts w:eastAsia="Arial" w:cs="Arial" w:ascii="Arial" w:hAnsi="Arial"/>
+                    <w:b w:val="false"/>
+                    <w:i w:val="false"/>
+                    <w:color w:val="auto"/>
+                    <w:spacing w:val="0"/>
+                    <w:w w:val="100"/>
+                    <w:sz w:val="16"/>
+                    <w:szCs w:val="16"/>
+                    <w:lang w:val="ro-RO"/>
+                  </w:rPr>
+                  <w:t xml:space="preserve">                                               </w:t>
+                </w:r>
+                <w:r>
+                  <w:rPr>
+                    <w:rFonts w:eastAsia="Arial" w:cs="Arial" w:ascii="Arial" w:hAnsi="Arial"/>
+                    <w:b w:val="false"/>
+                    <w:i w:val="false"/>
+                    <w:color w:val="auto"/>
+                    <w:spacing w:val="0"/>
+                    <w:w w:val="100"/>
+                    <w:sz w:val="16"/>
+                    <w:szCs w:val="16"/>
+                    <w:lang w:val="ro-RO"/>
+                  </w:rPr>
+                  <w:br/>
+                </w:r>
+                <w:r>
+                  <w:rPr>
+                    <w:rFonts w:eastAsia="Arial" w:cs="Arial" w:ascii="Arial" w:hAnsi="Arial"/>
+                    <w:b w:val="false"/>
+                    <w:i w:val="false"/>
+                    <w:color w:val="auto"/>
+                    <w:spacing w:val="0"/>
+                    <w:w w:val="100"/>
+                    <w:sz w:val="16"/>
+                    <w:szCs w:val="16"/>
+                    <w:lang w:val="ro-RO"/>
+                  </w:rPr>
+                  <w:t xml:space="preserve">                                               </w:t>
+                </w:r>
+              </w:sdtContent>
+            </w:sdt>
           </w:p>
         </w:tc>
         <w:tc>
@@ -45579,6 +46253,42 @@
                 <w:lang w:val="ro-RO"/>
               </w:rPr>
             </w:pPr>
+            <w:sdt>
+              <w:sdtPr>
+                <w:rPr>
+                  <w:rFonts w:eastAsia="Arial" w:cs="Arial" w:ascii="Arial" w:hAnsi="Arial"/>
+                  <w:b w:val="false"/>
+                  <w:i w:val="false"/>
+                  <w:color w:val="auto"/>
+                  <w:spacing w:val="0"/>
+                  <w:w w:val="100"/>
+                  <w:sz w:val="16"/>
+                  <w:szCs w:val="16"/>
+                  <w:lang w:val="ro-RO"/>
+                </w:rPr>
+                <w:alias w:val="t1_grade"/>
+                <w:tag w:val="t1_grade"/>
+                <w:id w:val="299"/>
+                <w:showingPlcHdr/>
+                <w:text/>
+              </w:sdtPr>
+              <w:sdtContent>
+                <w:r>
+                  <w:rPr>
+                    <w:rFonts w:eastAsia="Arial" w:cs="Arial" w:ascii="Arial" w:hAnsi="Arial"/>
+                    <w:b w:val="false"/>
+                    <w:i w:val="false"/>
+                    <w:color w:val="auto"/>
+                    <w:spacing w:val="0"/>
+                    <w:w w:val="100"/>
+                    <w:sz w:val="16"/>
+                    <w:szCs w:val="16"/>
+                    <w:lang w:val="ro-RO"/>
+                  </w:rPr>
+                  <w:t xml:space="preserve">                   </w:t>
+                </w:r>
+              </w:sdtContent>
+            </w:sdt>
           </w:p>
         </w:tc>
         <w:tc>
@@ -45614,13 +46324,91 @@
                 <w:lang w:val="ro-RO"/>
               </w:rPr>
             </w:pPr>
+            <w:sdt>
+              <w:sdtPr>
+                <w:rPr>
+                  <w:rFonts w:eastAsia="Arial" w:cs="Arial" w:ascii="Arial" w:hAnsi="Arial"/>
+                  <w:b w:val="false"/>
+                  <w:i w:val="false"/>
+                  <w:color w:val="auto"/>
+                  <w:spacing w:val="0"/>
+                  <w:w w:val="100"/>
+                  <w:sz w:val="16"/>
+                  <w:szCs w:val="16"/>
+                  <w:lang w:val="ro-RO"/>
+                </w:rPr>
+                <w:alias w:val="t1_examiner"/>
+                <w:tag w:val="t1_examiner"/>
+                <w:id w:val="300"/>
+                <w:showingPlcHdr/>
+                <w:text w:multiLine="1"/>
+              </w:sdtPr>
+              <w:sdtContent>
+                <w:r>
+                  <w:rPr>
+                    <w:rFonts w:eastAsia="Arial" w:cs="Arial" w:ascii="Arial" w:hAnsi="Arial"/>
+                    <w:b w:val="false"/>
+                    <w:i w:val="false"/>
+                    <w:color w:val="auto"/>
+                    <w:spacing w:val="0"/>
+                    <w:w w:val="100"/>
+                    <w:sz w:val="16"/>
+                    <w:szCs w:val="16"/>
+                    <w:lang w:val="ro-RO"/>
+                  </w:rPr>
+                  <w:t xml:space="preserve">                         </w:t>
+                </w:r>
+                <w:r>
+                  <w:rPr>
+                    <w:rFonts w:eastAsia="Arial" w:cs="Arial" w:ascii="Arial" w:hAnsi="Arial"/>
+                    <w:b w:val="false"/>
+                    <w:i w:val="false"/>
+                    <w:color w:val="auto"/>
+                    <w:spacing w:val="0"/>
+                    <w:w w:val="100"/>
+                    <w:sz w:val="16"/>
+                    <w:szCs w:val="16"/>
+                    <w:lang w:val="ro-RO"/>
+                  </w:rPr>
+                  <w:br/>
+                </w:r>
+                <w:r>
+                  <w:rPr>
+                    <w:rFonts w:eastAsia="Arial" w:cs="Arial" w:ascii="Arial" w:hAnsi="Arial"/>
+                    <w:b w:val="false"/>
+                    <w:i w:val="false"/>
+                    <w:color w:val="auto"/>
+                    <w:spacing w:val="0"/>
+                    <w:w w:val="100"/>
+                    <w:sz w:val="16"/>
+                    <w:szCs w:val="16"/>
+                    <w:lang w:val="ro-RO"/>
+                  </w:rPr>
+                  <w:t xml:space="preserve">                         </w:t>
+                </w:r>
+              </w:sdtContent>
+            </w:sdt>
+            <w:r>
+              <w:rPr>
+                <w:rFonts w:eastAsia="Arial" w:cs="Arial" w:ascii="Arial" w:hAnsi="Arial"/>
+                <w:b w:val="false"/>
+                <w:i w:val="false"/>
+                <w:color w:val="auto"/>
+                <w:spacing w:val="0"/>
+                <w:w w:val="100"/>
+                <w:sz w:val="16"/>
+                <w:szCs w:val="16"/>
+                <w:lang w:val="ro-RO"/>
+              </w:rPr>
+              <w:t xml:space="preserve">{{/form.rows.t1}}</w:t>
+            </w:r>
           </w:p>
         </w:tc>
       </w:tr>
       <w:tr>
         <w:trPr>
           <w:cantSplit/>
-          <w:trHeight w:val="480" w:hRule="atLeast"/>
+          <w:trHeight w:val="680" w:hRule="atLeast"/>
         </w:trPr>
         <w:tc>
           <w:tcPr>
@@ -45655,6 +46443,115 @@
                 <w:lang w:val="ro-RO"/>
               </w:rPr>
             </w:pPr>
+            <w:r>
+              <w:rPr>
+                <w:rFonts w:eastAsia="Arial" w:cs="Arial" w:ascii="Arial" w:hAnsi="Arial"/>
+                <w:b w:val="false"/>
+                <w:i w:val="false"/>
+                <w:color w:val="auto"/>
+                <w:spacing w:val="0"/>
+                <w:w w:val="100"/>
+                <w:sz w:val="16"/>
+                <w:szCs w:val="16"/>
+                <w:lang w:val="ro-RO"/>
+              </w:rPr>
+              <w:t xml:space="preserve">{{#form.rows.t2}}</w:t>
+            </w:r>
+            <w:sdt>
+              <w:sdtPr>
+                <w:rPr>
+                  <w:rFonts w:eastAsia="Arial" w:cs="Arial" w:ascii="Arial" w:hAnsi="Arial"/>
+                  <w:b w:val="false"/>
+                  <w:i w:val="false"/>
+                  <w:color w:val="auto"/>
+                  <w:spacing w:val="0"/>
+                  <w:w w:val="100"/>
+                  <w:sz w:val="16"/>
+                  <w:szCs w:val="16"/>
+                  <w:lang w:val="ro-RO"/>
+                </w:rPr>
+                <w:alias w:val="t2_date"/>
+                <w:tag w:val="t2_date"/>
+                <w:id w:val="301"/>
+                <w:showingPlcHdr/>
+                <w:text/>
+              </w:sdtPr>
+              <w:sdtContent>
+                <w:r>
+                  <w:rPr>
+                    <w:rFonts w:eastAsia="Arial" w:cs="Arial" w:ascii="Arial" w:hAnsi="Arial"/>
+                    <w:b w:val="false"/>
+                    <w:i w:val="false"/>
+                    <w:color w:val="auto"/>
+                    <w:spacing w:val="0"/>
+                    <w:w w:val="100"/>
+                    <w:sz w:val="16"/>
+                    <w:szCs w:val="16"/>
+                    <w:lang w:val="ro-RO"/>
+                  </w:rPr>
+                  <w:t xml:space="preserve">                </w:t>
+                </w:r>
+              </w:sdtContent>
+            </w:sdt>
+          </w:p>
+          <w:p>
+            <w:pPr>
+              <w:pStyle w:val="TableContents"/>
+              <w:keepNext w:val="false"/>
+              <w:pageBreakBefore w:val="false"/>
+              <w:widowControl/>
+              <w:bidi w:val="0"/>
+              <w:spacing w:before="0" w:after="0"/>
+              <w:ind w:hanging="0" w:left="0"/>
+              <w:jc w:val="left"/>
+              <w:rPr>
+                <w:rFonts w:eastAsia="Arial" w:cs="Arial" w:ascii="Arial" w:hAnsi="Arial"/>
+                <w:b w:val="false"/>
+                <w:i w:val="false"/>
+                <w:color w:val="auto"/>
+                <w:spacing w:val="0"/>
+                <w:w w:val="100"/>
+                <w:sz w:val="16"/>
+                <w:szCs w:val="16"/>
+                <w:lang w:val="ro-RO"/>
+              </w:rPr>
+            </w:pPr>
+            <w:sdt>
+              <w:sdtPr>
+                <w:rPr>
+                  <w:rFonts w:eastAsia="Arial" w:cs="Arial" w:ascii="Arial" w:hAnsi="Arial"/>
+                  <w:b w:val="false"/>
+                  <w:i w:val="false"/>
+                  <w:color w:val="auto"/>
+                  <w:spacing w:val="0"/>
+                  <w:w w:val="100"/>
+                  <w:sz w:val="16"/>
+                  <w:szCs w:val="16"/>
+                  <w:lang w:val="ro-RO"/>
+                </w:rPr>
+                <w:alias w:val="t2_note"/>
+                <w:tag w:val="t2_note"/>
+                <w:id w:val="302"/>
+                <w:showingPlcHdr/>
+                <w:text/>
+              </w:sdtPr>
+              <w:sdtContent>
+                <w:r>
+                  <w:rPr>
+                    <w:rFonts w:eastAsia="Arial" w:cs="Arial" w:ascii="Arial" w:hAnsi="Arial"/>
+                    <w:b w:val="false"/>
+                    <w:i w:val="false"/>
+                    <w:color w:val="auto"/>
+                    <w:spacing w:val="0"/>
+                    <w:w w:val="100"/>
+                    <w:sz w:val="16"/>
+                    <w:szCs w:val="16"/>
+                    <w:lang w:val="ro-RO"/>
+                  </w:rPr>
+                  <w:t xml:space="preserve">                </w:t>
+                </w:r>
+              </w:sdtContent>
+            </w:sdt>
           </w:p>
         </w:tc>
         <w:tc>
@@ -45690,6 +46587,98 @@
                 <w:lang w:val="ro-RO"/>
               </w:rPr>
             </w:pPr>
+            <w:sdt>
+              <w:sdtPr>
+                <w:rPr>
+                  <w:rFonts w:eastAsia="Arial" w:cs="Arial" w:ascii="Arial" w:hAnsi="Arial"/>
+                  <w:b w:val="false"/>
+                  <w:i w:val="false"/>
+                  <w:color w:val="auto"/>
+                  <w:spacing w:val="0"/>
+                  <w:w w:val="100"/>
+                  <w:sz w:val="16"/>
+                  <w:szCs w:val="16"/>
+                  <w:lang w:val="ro-RO"/>
+                </w:rPr>
+                <w:alias w:val="t2_material"/>
+                <w:tag w:val="t2_material"/>
+                <w:id w:val="303"/>
+                <w:showingPlcHdr/>
+                <w:text w:multiLine="1"/>
+              </w:sdtPr>
+              <w:sdtContent>
+                <w:r>
+                  <w:rPr>
+                    <w:rFonts w:eastAsia="Arial" w:cs="Arial" w:ascii="Arial" w:hAnsi="Arial"/>
+                    <w:b w:val="false"/>
+                    <w:i w:val="false"/>
+                    <w:color w:val="auto"/>
+                    <w:spacing w:val="0"/>
+                    <w:w w:val="100"/>
+                    <w:sz w:val="16"/>
+                    <w:szCs w:val="16"/>
+                    <w:lang w:val="ro-RO"/>
+                  </w:rPr>
+                  <w:t xml:space="preserve">                                               </w:t>
+                </w:r>
+                <w:r>
+                  <w:rPr>
+                    <w:rFonts w:eastAsia="Arial" w:cs="Arial" w:ascii="Arial" w:hAnsi="Arial"/>
+                    <w:b w:val="false"/>
+                    <w:i w:val="false"/>
+                    <w:color w:val="auto"/>
+                    <w:spacing w:val="0"/>
+                    <w:w w:val="100"/>
+                    <w:sz w:val="16"/>
+                    <w:szCs w:val="16"/>
+                    <w:lang w:val="ro-RO"/>
+                  </w:rPr>
+                  <w:br/>
+                </w:r>
+                <w:r>
+                  <w:rPr>
+                    <w:rFonts w:eastAsia="Arial" w:cs="Arial" w:ascii="Arial" w:hAnsi="Arial"/>
+                    <w:b w:val="false"/>
+                    <w:i w:val="false"/>
+                    <w:color w:val="auto"/>
+                    <w:spacing w:val="0"/>
+                    <w:w w:val="100"/>
+                    <w:sz w:val="16"/>
+                    <w:szCs w:val="16"/>
+                    <w:lang w:val="ro-RO"/>
+                  </w:rPr>
+                  <w:t xml:space="preserve">                                               </w:t>
+                </w:r>
+                <w:r>
+                  <w:rPr>
+                    <w:rFonts w:eastAsia="Arial" w:cs="Arial" w:ascii="Arial" w:hAnsi="Arial"/>
+                    <w:b w:val="false"/>
+                    <w:i w:val="false"/>
+                    <w:color w:val="auto"/>
+                    <w:spacing w:val="0"/>
+                    <w:w w:val="100"/>
+                    <w:sz w:val="16"/>
+                    <w:szCs w:val="16"/>
+                    <w:lang w:val="ro-RO"/>
+                  </w:rPr>
+                  <w:br/>
+                </w:r>
+                <w:r>
+                  <w:rPr>
+                    <w:rFonts w:eastAsia="Arial" w:cs="Arial" w:ascii="Arial" w:hAnsi="Arial"/>
+                    <w:b w:val="false"/>
+                    <w:i w:val="false"/>
+                    <w:color w:val="auto"/>
+                    <w:spacing w:val="0"/>
+                    <w:w w:val="100"/>
+                    <w:sz w:val="16"/>
+                    <w:szCs w:val="16"/>
+                    <w:lang w:val="ro-RO"/>
+                  </w:rPr>
+                  <w:t xml:space="preserve">                                               </w:t>
+                </w:r>
+              </w:sdtContent>
+            </w:sdt>
           </w:p>
         </w:tc>
         <w:tc>
@@ -45725,6 +46714,42 @@
                 <w:lang w:val="ro-RO"/>
               </w:rPr>
             </w:pPr>
+            <w:sdt>
+              <w:sdtPr>
+                <w:rPr>
+                  <w:rFonts w:eastAsia="Arial" w:cs="Arial" w:ascii="Arial" w:hAnsi="Arial"/>
+                  <w:b w:val="false"/>
+                  <w:i w:val="false"/>
+                  <w:color w:val="auto"/>
+                  <w:spacing w:val="0"/>
+                  <w:w w:val="100"/>
+                  <w:sz w:val="16"/>
+                  <w:szCs w:val="16"/>
+                  <w:lang w:val="ro-RO"/>
+                </w:rPr>
+                <w:alias w:val="t2_grade"/>
+                <w:tag w:val="t2_grade"/>
+                <w:id w:val="304"/>
+                <w:showingPlcHdr/>
+                <w:text/>
+              </w:sdtPr>
+              <w:sdtContent>
+                <w:r>
+                  <w:rPr>
+                    <w:rFonts w:eastAsia="Arial" w:cs="Arial" w:ascii="Arial" w:hAnsi="Arial"/>
+                    <w:b w:val="false"/>
+                    <w:i w:val="false"/>
+                    <w:color w:val="auto"/>
+                    <w:spacing w:val="0"/>
+                    <w:w w:val="100"/>
+                    <w:sz w:val="16"/>
+                    <w:szCs w:val="16"/>
+                    <w:lang w:val="ro-RO"/>
+                  </w:rPr>
+                  <w:t xml:space="preserve">                   </w:t>
+                </w:r>
+              </w:sdtContent>
+            </w:sdt>
           </w:p>
         </w:tc>
         <w:tc>
@@ -45760,10 +46785,1508 @@
                 <w:lang w:val="ro-RO"/>
               </w:rPr>
             </w:pPr>
+            <w:sdt>
+              <w:sdtPr>
+                <w:rPr>
+                  <w:rFonts w:eastAsia="Arial" w:cs="Arial" w:ascii="Arial" w:hAnsi="Arial"/>
+                  <w:b w:val="false"/>
+                  <w:i w:val="false"/>
+                  <w:color w:val="auto"/>
+                  <w:spacing w:val="0"/>
+                  <w:w w:val="100"/>
+                  <w:sz w:val="16"/>
+                  <w:szCs w:val="16"/>
+                  <w:lang w:val="ro-RO"/>
+                </w:rPr>
+                <w:alias w:val="t2_examiner"/>
+                <w:tag w:val="t2_examiner"/>
+                <w:id w:val="305"/>
+                <w:showingPlcHdr/>
+                <w:text w:multiLine="1"/>
+              </w:sdtPr>
+              <w:sdtContent>
+                <w:r>
+                  <w:rPr>
+                    <w:rFonts w:eastAsia="Arial" w:cs="Arial" w:ascii="Arial" w:hAnsi="Arial"/>
+                    <w:b w:val="false"/>
+                    <w:i w:val="false"/>
+                    <w:color w:val="auto"/>
+                    <w:spacing w:val="0"/>
+                    <w:w w:val="100"/>
+                    <w:sz w:val="16"/>
+                    <w:szCs w:val="16"/>
+                    <w:lang w:val="ro-RO"/>
+                  </w:rPr>
+                  <w:t xml:space="preserve">                         </w:t>
+                </w:r>
+                <w:r>
+                  <w:rPr>
+                    <w:rFonts w:eastAsia="Arial" w:cs="Arial" w:ascii="Arial" w:hAnsi="Arial"/>
+                    <w:b w:val="false"/>
+                    <w:i w:val="false"/>
+                    <w:color w:val="auto"/>
+                    <w:spacing w:val="0"/>
+                    <w:w w:val="100"/>
+                    <w:sz w:val="16"/>
+                    <w:szCs w:val="16"/>
+                    <w:lang w:val="ro-RO"/>
+                  </w:rPr>
+                  <w:br/>
+                </w:r>
+                <w:r>
+                  <w:rPr>
+                    <w:rFonts w:eastAsia="Arial" w:cs="Arial" w:ascii="Arial" w:hAnsi="Arial"/>
+                    <w:b w:val="false"/>
+                    <w:i w:val="false"/>
+                    <w:color w:val="auto"/>
+                    <w:spacing w:val="0"/>
+                    <w:w w:val="100"/>
+                    <w:sz w:val="16"/>
+                    <w:szCs w:val="16"/>
+                    <w:lang w:val="ro-RO"/>
+                  </w:rPr>
+                  <w:t xml:space="preserve">                         </w:t>
+                </w:r>
+              </w:sdtContent>
+            </w:sdt>
+            <w:r>
+              <w:rPr>
+                <w:rFonts w:eastAsia="Arial" w:cs="Arial" w:ascii="Arial" w:hAnsi="Arial"/>
+                <w:b w:val="false"/>
+                <w:i w:val="false"/>
+                <w:color w:val="auto"/>
+                <w:spacing w:val="0"/>
+                <w:w w:val="100"/>
+                <w:sz w:val="16"/>
+                <w:szCs w:val="16"/>
+                <w:lang w:val="ro-RO"/>
+              </w:rPr>
+              <w:t xml:space="preserve">{{/form.rows.t2}}</w:t>
+            </w:r>
+          </w:p>
+        </w:tc>
+      </w:tr>
+      <w:tr>
+        <w:trPr>
+          <w:cantSplit/>
+          <w:trHeight w:val="680" w:hRule="atLeast"/>
+        </w:trPr>
+        <w:tc>
+          <w:tcPr>
+            <w:tcW w:w="1500" w:type="dxa"/>
+            <w:tcBorders>
+              <w:top w:val="single" w:sz="4" w:space="0" w:color="000000"/>
+              <w:left w:val="single" w:sz="4" w:space="0" w:color="000000"/>
+              <w:bottom w:val="single" w:sz="4" w:space="0" w:color="000000"/>
+              <w:right w:val="single" w:sz="4" w:space="0" w:color="000000"/>
+            </w:tcBorders>
+            <w:vAlign w:val="top"/>
+          </w:tcPr>
+          <w:p>
+            <w:pPr>
+              <w:pStyle w:val="TableContents"/>
+              <w:keepNext w:val="false"/>
+              <w:pageBreakBefore w:val="false"/>
+              <w:widowControl/>
+              <w:bidi w:val="0"/>
+              <w:spacing w:before="0" w:after="0"/>
+              <w:ind w:hanging="0" w:left="0"/>
+              <w:jc w:val="left"/>
+              <w:rPr>
+                <w:rFonts w:eastAsia="Arial" w:cs="Arial" w:ascii="Arial" w:hAnsi="Arial"/>
+                <w:b w:val="false"/>
+                <w:i w:val="false"/>
+                <w:color w:val="auto"/>
+                <w:spacing w:val="0"/>
+                <w:w w:val="100"/>
+                <w:sz w:val="16"/>
+                <w:szCs w:val="16"/>
+                <w:lang w:val="ro-RO"/>
+              </w:rPr>
+            </w:pPr>
+            <w:r>
+              <w:rPr>
+                <w:rFonts w:eastAsia="Arial" w:cs="Arial" w:ascii="Arial" w:hAnsi="Arial"/>
+                <w:b w:val="false"/>
+                <w:i w:val="false"/>
+                <w:color w:val="auto"/>
+                <w:spacing w:val="0"/>
+                <w:w w:val="100"/>
+                <w:sz w:val="16"/>
+                <w:szCs w:val="16"/>
+                <w:lang w:val="ro-RO"/>
+              </w:rPr>
+              <w:t xml:space="preserve">{{#form.rows.t3}}</w:t>
+            </w:r>
+            <w:sdt>
+              <w:sdtPr>
+                <w:rPr>
+                  <w:rFonts w:eastAsia="Arial" w:cs="Arial" w:ascii="Arial" w:hAnsi="Arial"/>
+                  <w:b w:val="false"/>
+                  <w:i w:val="false"/>
+                  <w:color w:val="auto"/>
+                  <w:spacing w:val="0"/>
+                  <w:w w:val="100"/>
+                  <w:sz w:val="16"/>
+                  <w:szCs w:val="16"/>
+                  <w:lang w:val="ro-RO"/>
+                </w:rPr>
+                <w:alias w:val="t3_date"/>
+                <w:tag w:val="t3_date"/>
+                <w:id w:val="306"/>
+                <w:showingPlcHdr/>
+                <w:text/>
+              </w:sdtPr>
+              <w:sdtContent>
+                <w:r>
+                  <w:rPr>
+                    <w:rFonts w:eastAsia="Arial" w:cs="Arial" w:ascii="Arial" w:hAnsi="Arial"/>
+                    <w:b w:val="false"/>
+                    <w:i w:val="false"/>
+                    <w:color w:val="auto"/>
+                    <w:spacing w:val="0"/>
+                    <w:w w:val="100"/>
+                    <w:sz w:val="16"/>
+                    <w:szCs w:val="16"/>
+                    <w:lang w:val="ro-RO"/>
+                  </w:rPr>
+                  <w:t xml:space="preserve">                </w:t>
+                </w:r>
+              </w:sdtContent>
+            </w:sdt>
+          </w:p>
+          <w:p>
+            <w:pPr>
+              <w:pStyle w:val="TableContents"/>
+              <w:keepNext w:val="false"/>
+              <w:pageBreakBefore w:val="false"/>
+              <w:widowControl/>
+              <w:bidi w:val="0"/>
+              <w:spacing w:before="0" w:after="0"/>
+              <w:ind w:hanging="0" w:left="0"/>
+              <w:jc w:val="left"/>
+              <w:rPr>
+                <w:rFonts w:eastAsia="Arial" w:cs="Arial" w:ascii="Arial" w:hAnsi="Arial"/>
+                <w:b w:val="false"/>
+                <w:i w:val="false"/>
+                <w:color w:val="auto"/>
+                <w:spacing w:val="0"/>
+                <w:w w:val="100"/>
+                <w:sz w:val="16"/>
+                <w:szCs w:val="16"/>
+                <w:lang w:val="ro-RO"/>
+              </w:rPr>
+            </w:pPr>
+            <w:sdt>
+              <w:sdtPr>
+                <w:rPr>
+                  <w:rFonts w:eastAsia="Arial" w:cs="Arial" w:ascii="Arial" w:hAnsi="Arial"/>
+                  <w:b w:val="false"/>
+                  <w:i w:val="false"/>
+                  <w:color w:val="auto"/>
+                  <w:spacing w:val="0"/>
+                  <w:w w:val="100"/>
+                  <w:sz w:val="16"/>
+                  <w:szCs w:val="16"/>
+                  <w:lang w:val="ro-RO"/>
+                </w:rPr>
+                <w:alias w:val="t3_note"/>
+                <w:tag w:val="t3_note"/>
+                <w:id w:val="307"/>
+                <w:showingPlcHdr/>
+                <w:text/>
+              </w:sdtPr>
+              <w:sdtContent>
+                <w:r>
+                  <w:rPr>
+                    <w:rFonts w:eastAsia="Arial" w:cs="Arial" w:ascii="Arial" w:hAnsi="Arial"/>
+                    <w:b w:val="false"/>
+                    <w:i w:val="false"/>
+                    <w:color w:val="auto"/>
+                    <w:spacing w:val="0"/>
+                    <w:w w:val="100"/>
+                    <w:sz w:val="16"/>
+                    <w:szCs w:val="16"/>
+                    <w:lang w:val="ro-RO"/>
+                  </w:rPr>
+                  <w:t xml:space="preserve">                </w:t>
+                </w:r>
+              </w:sdtContent>
+            </w:sdt>
+          </w:p>
+        </w:tc>
+        <w:tc>
+          <w:tcPr>
+            <w:tcW w:w="3955" w:type="dxa"/>
+            <w:tcBorders>
+              <w:top w:val="single" w:sz="4" w:space="0" w:color="000000"/>
+              <w:left w:val="single" w:sz="4" w:space="0" w:color="000000"/>
+              <w:bottom w:val="single" w:sz="4" w:space="0" w:color="000000"/>
+              <w:right w:val="single" w:sz="4" w:space="0" w:color="000000"/>
+            </w:tcBorders>
+            <w:vAlign w:val="top"/>
+          </w:tcPr>
+          <w:p>
+            <w:pPr>
+              <w:pStyle w:val="TableContents"/>
+              <w:keepNext w:val="false"/>
+              <w:pageBreakBefore w:val="false"/>
+              <w:widowControl/>
+              <w:bidi w:val="0"/>
+              <w:spacing w:before="0" w:after="0"/>
+              <w:ind w:hanging="0" w:left="0"/>
+              <w:jc w:val="left"/>
+              <w:rPr>
+                <w:rFonts w:eastAsia="Arial" w:cs="Arial" w:ascii="Arial" w:hAnsi="Arial"/>
+                <w:b w:val="false"/>
+                <w:i w:val="false"/>
+                <w:color w:val="auto"/>
+                <w:spacing w:val="0"/>
+                <w:w w:val="100"/>
+                <w:sz w:val="16"/>
+                <w:szCs w:val="16"/>
+                <w:lang w:val="ro-RO"/>
+              </w:rPr>
+            </w:pPr>
+            <w:sdt>
+              <w:sdtPr>
+                <w:rPr>
+                  <w:rFonts w:eastAsia="Arial" w:cs="Arial" w:ascii="Arial" w:hAnsi="Arial"/>
+                  <w:b w:val="false"/>
+                  <w:i w:val="false"/>
+                  <w:color w:val="auto"/>
+                  <w:spacing w:val="0"/>
+                  <w:w w:val="100"/>
+                  <w:sz w:val="16"/>
+                  <w:szCs w:val="16"/>
+                  <w:lang w:val="ro-RO"/>
+                </w:rPr>
+                <w:alias w:val="t3_material"/>
+                <w:tag w:val="t3_material"/>
+                <w:id w:val="308"/>
+                <w:showingPlcHdr/>
+                <w:text w:multiLine="1"/>
+              </w:sdtPr>
+              <w:sdtContent>
+                <w:r>
+                  <w:rPr>
+                    <w:rFonts w:eastAsia="Arial" w:cs="Arial" w:ascii="Arial" w:hAnsi="Arial"/>
+                    <w:b w:val="false"/>
+                    <w:i w:val="false"/>
+                    <w:color w:val="auto"/>
+                    <w:spacing w:val="0"/>
+                    <w:w w:val="100"/>
+                    <w:sz w:val="16"/>
+                    <w:szCs w:val="16"/>
+                    <w:lang w:val="ro-RO"/>
+                  </w:rPr>
+                  <w:t xml:space="preserve">                                               </w:t>
+                </w:r>
+                <w:r>
+                  <w:rPr>
+                    <w:rFonts w:eastAsia="Arial" w:cs="Arial" w:ascii="Arial" w:hAnsi="Arial"/>
+                    <w:b w:val="false"/>
+                    <w:i w:val="false"/>
+                    <w:color w:val="auto"/>
+                    <w:spacing w:val="0"/>
+                    <w:w w:val="100"/>
+                    <w:sz w:val="16"/>
+                    <w:szCs w:val="16"/>
+                    <w:lang w:val="ro-RO"/>
+                  </w:rPr>
+                  <w:br/>
+                </w:r>
+                <w:r>
+                  <w:rPr>
+                    <w:rFonts w:eastAsia="Arial" w:cs="Arial" w:ascii="Arial" w:hAnsi="Arial"/>
+                    <w:b w:val="false"/>
+                    <w:i w:val="false"/>
+                    <w:color w:val="auto"/>
+                    <w:spacing w:val="0"/>
+                    <w:w w:val="100"/>
+                    <w:sz w:val="16"/>
+                    <w:szCs w:val="16"/>
+                    <w:lang w:val="ro-RO"/>
+                  </w:rPr>
+                  <w:t xml:space="preserve">                                               </w:t>
+                </w:r>
+                <w:r>
+                  <w:rPr>
+                    <w:rFonts w:eastAsia="Arial" w:cs="Arial" w:ascii="Arial" w:hAnsi="Arial"/>
+                    <w:b w:val="false"/>
+                    <w:i w:val="false"/>
+                    <w:color w:val="auto"/>
+                    <w:spacing w:val="0"/>
+                    <w:w w:val="100"/>
+                    <w:sz w:val="16"/>
+                    <w:szCs w:val="16"/>
+                    <w:lang w:val="ro-RO"/>
+                  </w:rPr>
+                  <w:br/>
+                </w:r>
+                <w:r>
+                  <w:rPr>
+                    <w:rFonts w:eastAsia="Arial" w:cs="Arial" w:ascii="Arial" w:hAnsi="Arial"/>
+                    <w:b w:val="false"/>
+                    <w:i w:val="false"/>
+                    <w:color w:val="auto"/>
+                    <w:spacing w:val="0"/>
+                    <w:w w:val="100"/>
+                    <w:sz w:val="16"/>
+                    <w:szCs w:val="16"/>
+                    <w:lang w:val="ro-RO"/>
+                  </w:rPr>
+                  <w:t xml:space="preserve">                                               </w:t>
+                </w:r>
+              </w:sdtContent>
+            </w:sdt>
+          </w:p>
+        </w:tc>
+        <w:tc>
+          <w:tcPr>
+            <w:tcW w:w="1700" w:type="dxa"/>
+            <w:tcBorders>
+              <w:top w:val="single" w:sz="4" w:space="0" w:color="000000"/>
+              <w:left w:val="single" w:sz="4" w:space="0" w:color="000000"/>
+              <w:bottom w:val="single" w:sz="4" w:space="0" w:color="000000"/>
+              <w:right w:val="single" w:sz="4" w:space="0" w:color="000000"/>
+            </w:tcBorders>
+            <w:vAlign w:val="top"/>
+          </w:tcPr>
+          <w:p>
+            <w:pPr>
+              <w:pStyle w:val="TableContents"/>
+              <w:keepNext w:val="false"/>
+              <w:pageBreakBefore w:val="false"/>
+              <w:widowControl/>
+              <w:bidi w:val="0"/>
+              <w:spacing w:before="0" w:after="0"/>
+              <w:ind w:hanging="0" w:left="0"/>
+              <w:jc w:val="left"/>
+              <w:rPr>
+                <w:rFonts w:eastAsia="Arial" w:cs="Arial" w:ascii="Arial" w:hAnsi="Arial"/>
+                <w:b w:val="false"/>
+                <w:i w:val="false"/>
+                <w:color w:val="auto"/>
+                <w:spacing w:val="0"/>
+                <w:w w:val="100"/>
+                <w:sz w:val="16"/>
+                <w:szCs w:val="16"/>
+                <w:lang w:val="ro-RO"/>
+              </w:rPr>
+            </w:pPr>
+            <w:sdt>
+              <w:sdtPr>
+                <w:rPr>
+                  <w:rFonts w:eastAsia="Arial" w:cs="Arial" w:ascii="Arial" w:hAnsi="Arial"/>
+                  <w:b w:val="false"/>
+                  <w:i w:val="false"/>
+                  <w:color w:val="auto"/>
+                  <w:spacing w:val="0"/>
+                  <w:w w:val="100"/>
+                  <w:sz w:val="16"/>
+                  <w:szCs w:val="16"/>
+                  <w:lang w:val="ro-RO"/>
+                </w:rPr>
+                <w:alias w:val="t3_grade"/>
+                <w:tag w:val="t3_grade"/>
+                <w:id w:val="309"/>
+                <w:showingPlcHdr/>
+                <w:text/>
+              </w:sdtPr>
+              <w:sdtContent>
+                <w:r>
+                  <w:rPr>
+                    <w:rFonts w:eastAsia="Arial" w:cs="Arial" w:ascii="Arial" w:hAnsi="Arial"/>
+                    <w:b w:val="false"/>
+                    <w:i w:val="false"/>
+                    <w:color w:val="auto"/>
+                    <w:spacing w:val="0"/>
+                    <w:w w:val="100"/>
+                    <w:sz w:val="16"/>
+                    <w:szCs w:val="16"/>
+                    <w:lang w:val="ro-RO"/>
+                  </w:rPr>
+                  <w:t xml:space="preserve">                   </w:t>
+                </w:r>
+              </w:sdtContent>
+            </w:sdt>
+          </w:p>
+        </w:tc>
+        <w:tc>
+          <w:tcPr>
+            <w:tcW w:w="2200" w:type="dxa"/>
+            <w:tcBorders>
+              <w:top w:val="single" w:sz="4" w:space="0" w:color="000000"/>
+              <w:left w:val="single" w:sz="4" w:space="0" w:color="000000"/>
+              <w:bottom w:val="single" w:sz="4" w:space="0" w:color="000000"/>
+              <w:right w:val="single" w:sz="4" w:space="0" w:color="000000"/>
+            </w:tcBorders>
+            <w:vAlign w:val="top"/>
+          </w:tcPr>
+          <w:p>
+            <w:pPr>
+              <w:pStyle w:val="TableContents"/>
+              <w:keepNext w:val="false"/>
+              <w:pageBreakBefore w:val="false"/>
+              <w:widowControl/>
+              <w:bidi w:val="0"/>
+              <w:spacing w:before="0" w:after="0"/>
+              <w:ind w:hanging="0" w:left="0"/>
+              <w:jc w:val="left"/>
+              <w:rPr>
+                <w:rFonts w:eastAsia="Arial" w:cs="Arial" w:ascii="Arial" w:hAnsi="Arial"/>
+                <w:b w:val="false"/>
+                <w:i w:val="false"/>
+                <w:color w:val="auto"/>
+                <w:spacing w:val="0"/>
+                <w:w w:val="100"/>
+                <w:sz w:val="16"/>
+                <w:szCs w:val="16"/>
+                <w:lang w:val="ro-RO"/>
+              </w:rPr>
+            </w:pPr>
+            <w:sdt>
+              <w:sdtPr>
+                <w:rPr>
+                  <w:rFonts w:eastAsia="Arial" w:cs="Arial" w:ascii="Arial" w:hAnsi="Arial"/>
+                  <w:b w:val="false"/>
+                  <w:i w:val="false"/>
+                  <w:color w:val="auto"/>
+                  <w:spacing w:val="0"/>
+                  <w:w w:val="100"/>
+                  <w:sz w:val="16"/>
+                  <w:szCs w:val="16"/>
+                  <w:lang w:val="ro-RO"/>
+                </w:rPr>
+                <w:alias w:val="t3_examiner"/>
+                <w:tag w:val="t3_examiner"/>
+                <w:id w:val="310"/>
+                <w:showingPlcHdr/>
+                <w:text w:multiLine="1"/>
+              </w:sdtPr>
+              <w:sdtContent>
+                <w:r>
+                  <w:rPr>
+                    <w:rFonts w:eastAsia="Arial" w:cs="Arial" w:ascii="Arial" w:hAnsi="Arial"/>
+                    <w:b w:val="false"/>
+                    <w:i w:val="false"/>
+                    <w:color w:val="auto"/>
+                    <w:spacing w:val="0"/>
+                    <w:w w:val="100"/>
+                    <w:sz w:val="16"/>
+                    <w:szCs w:val="16"/>
+                    <w:lang w:val="ro-RO"/>
+                  </w:rPr>
+                  <w:t xml:space="preserve">                         </w:t>
+                </w:r>
+                <w:r>
+                  <w:rPr>
+                    <w:rFonts w:eastAsia="Arial" w:cs="Arial" w:ascii="Arial" w:hAnsi="Arial"/>
+                    <w:b w:val="false"/>
+                    <w:i w:val="false"/>
+                    <w:color w:val="auto"/>
+                    <w:spacing w:val="0"/>
+                    <w:w w:val="100"/>
+                    <w:sz w:val="16"/>
+                    <w:szCs w:val="16"/>
+                    <w:lang w:val="ro-RO"/>
+                  </w:rPr>
+                  <w:br/>
+                </w:r>
+                <w:r>
+                  <w:rPr>
+                    <w:rFonts w:eastAsia="Arial" w:cs="Arial" w:ascii="Arial" w:hAnsi="Arial"/>
+                    <w:b w:val="false"/>
+                    <w:i w:val="false"/>
+                    <w:color w:val="auto"/>
+                    <w:spacing w:val="0"/>
+                    <w:w w:val="100"/>
+                    <w:sz w:val="16"/>
+                    <w:szCs w:val="16"/>
+                    <w:lang w:val="ro-RO"/>
+                  </w:rPr>
+                  <w:t xml:space="preserve">                         </w:t>
+                </w:r>
+              </w:sdtContent>
+            </w:sdt>
+            <w:r>
+              <w:rPr>
+                <w:rFonts w:eastAsia="Arial" w:cs="Arial" w:ascii="Arial" w:hAnsi="Arial"/>
+                <w:b w:val="false"/>
+                <w:i w:val="false"/>
+                <w:color w:val="auto"/>
+                <w:spacing w:val="0"/>
+                <w:w w:val="100"/>
+                <w:sz w:val="16"/>
+                <w:szCs w:val="16"/>
+                <w:lang w:val="ro-RO"/>
+              </w:rPr>
+              <w:t xml:space="preserve">{{/form.rows.t3}}</w:t>
+            </w:r>
+          </w:p>
+        </w:tc>
+      </w:tr>
+      <w:tr>
+        <w:trPr>
+          <w:cantSplit/>
+          <w:trHeight w:val="680" w:hRule="atLeast"/>
+        </w:trPr>
+        <w:tc>
+          <w:tcPr>
+            <w:tcW w:w="1500" w:type="dxa"/>
+            <w:tcBorders>
+              <w:top w:val="single" w:sz="4" w:space="0" w:color="000000"/>
+              <w:left w:val="single" w:sz="4" w:space="0" w:color="000000"/>
+              <w:bottom w:val="single" w:sz="4" w:space="0" w:color="000000"/>
+              <w:right w:val="single" w:sz="4" w:space="0" w:color="000000"/>
+            </w:tcBorders>
+            <w:vAlign w:val="top"/>
+          </w:tcPr>
+          <w:p>
+            <w:pPr>
+              <w:pStyle w:val="TableContents"/>
+              <w:keepNext w:val="false"/>
+              <w:pageBreakBefore w:val="false"/>
+              <w:widowControl/>
+              <w:bidi w:val="0"/>
+              <w:spacing w:before="0" w:after="0"/>
+              <w:ind w:hanging="0" w:left="0"/>
+              <w:jc w:val="left"/>
+              <w:rPr>
+                <w:rFonts w:eastAsia="Arial" w:cs="Arial" w:ascii="Arial" w:hAnsi="Arial"/>
+                <w:b w:val="false"/>
+                <w:i w:val="false"/>
+                <w:color w:val="auto"/>
+                <w:spacing w:val="0"/>
+                <w:w w:val="100"/>
+                <w:sz w:val="16"/>
+                <w:szCs w:val="16"/>
+                <w:lang w:val="ro-RO"/>
+              </w:rPr>
+            </w:pPr>
+            <w:r>
+              <w:rPr>
+                <w:rFonts w:eastAsia="Arial" w:cs="Arial" w:ascii="Arial" w:hAnsi="Arial"/>
+                <w:b w:val="false"/>
+                <w:i w:val="false"/>
+                <w:color w:val="auto"/>
+                <w:spacing w:val="0"/>
+                <w:w w:val="100"/>
+                <w:sz w:val="16"/>
+                <w:szCs w:val="16"/>
+                <w:lang w:val="ro-RO"/>
+              </w:rPr>
+              <w:t xml:space="preserve">{{#form.rows.t4}}</w:t>
+            </w:r>
+            <w:sdt>
+              <w:sdtPr>
+                <w:rPr>
+                  <w:rFonts w:eastAsia="Arial" w:cs="Arial" w:ascii="Arial" w:hAnsi="Arial"/>
+                  <w:b w:val="false"/>
+                  <w:i w:val="false"/>
+                  <w:color w:val="auto"/>
+                  <w:spacing w:val="0"/>
+                  <w:w w:val="100"/>
+                  <w:sz w:val="16"/>
+                  <w:szCs w:val="16"/>
+                  <w:lang w:val="ro-RO"/>
+                </w:rPr>
+                <w:alias w:val="t4_date"/>
+                <w:tag w:val="t4_date"/>
+                <w:id w:val="311"/>
+                <w:showingPlcHdr/>
+                <w:text/>
+              </w:sdtPr>
+              <w:sdtContent>
+                <w:r>
+                  <w:rPr>
+                    <w:rFonts w:eastAsia="Arial" w:cs="Arial" w:ascii="Arial" w:hAnsi="Arial"/>
+                    <w:b w:val="false"/>
+                    <w:i w:val="false"/>
+                    <w:color w:val="auto"/>
+                    <w:spacing w:val="0"/>
+                    <w:w w:val="100"/>
+                    <w:sz w:val="16"/>
+                    <w:szCs w:val="16"/>
+                    <w:lang w:val="ro-RO"/>
+                  </w:rPr>
+                  <w:t xml:space="preserve">                </w:t>
+                </w:r>
+              </w:sdtContent>
+            </w:sdt>
+          </w:p>
+          <w:p>
+            <w:pPr>
+              <w:pStyle w:val="TableContents"/>
+              <w:keepNext w:val="false"/>
+              <w:pageBreakBefore w:val="false"/>
+              <w:widowControl/>
+              <w:bidi w:val="0"/>
+              <w:spacing w:before="0" w:after="0"/>
+              <w:ind w:hanging="0" w:left="0"/>
+              <w:jc w:val="left"/>
+              <w:rPr>
+                <w:rFonts w:eastAsia="Arial" w:cs="Arial" w:ascii="Arial" w:hAnsi="Arial"/>
+                <w:b w:val="false"/>
+                <w:i w:val="false"/>
+                <w:color w:val="auto"/>
+                <w:spacing w:val="0"/>
+                <w:w w:val="100"/>
+                <w:sz w:val="16"/>
+                <w:szCs w:val="16"/>
+                <w:lang w:val="ro-RO"/>
+              </w:rPr>
+            </w:pPr>
+            <w:sdt>
+              <w:sdtPr>
+                <w:rPr>
+                  <w:rFonts w:eastAsia="Arial" w:cs="Arial" w:ascii="Arial" w:hAnsi="Arial"/>
+                  <w:b w:val="false"/>
+                  <w:i w:val="false"/>
+                  <w:color w:val="auto"/>
+                  <w:spacing w:val="0"/>
+                  <w:w w:val="100"/>
+                  <w:sz w:val="16"/>
+                  <w:szCs w:val="16"/>
+                  <w:lang w:val="ro-RO"/>
+                </w:rPr>
+                <w:alias w:val="t4_note"/>
+                <w:tag w:val="t4_note"/>
+                <w:id w:val="312"/>
+                <w:showingPlcHdr/>
+                <w:text/>
+              </w:sdtPr>
+              <w:sdtContent>
+                <w:r>
+                  <w:rPr>
+                    <w:rFonts w:eastAsia="Arial" w:cs="Arial" w:ascii="Arial" w:hAnsi="Arial"/>
+                    <w:b w:val="false"/>
+                    <w:i w:val="false"/>
+                    <w:color w:val="auto"/>
+                    <w:spacing w:val="0"/>
+                    <w:w w:val="100"/>
+                    <w:sz w:val="16"/>
+                    <w:szCs w:val="16"/>
+                    <w:lang w:val="ro-RO"/>
+                  </w:rPr>
+                  <w:t xml:space="preserve">                </w:t>
+                </w:r>
+              </w:sdtContent>
+            </w:sdt>
+          </w:p>
+        </w:tc>
+        <w:tc>
+          <w:tcPr>
+            <w:tcW w:w="3955" w:type="dxa"/>
+            <w:tcBorders>
+              <w:top w:val="single" w:sz="4" w:space="0" w:color="000000"/>
+              <w:left w:val="single" w:sz="4" w:space="0" w:color="000000"/>
+              <w:bottom w:val="single" w:sz="4" w:space="0" w:color="000000"/>
+              <w:right w:val="single" w:sz="4" w:space="0" w:color="000000"/>
+            </w:tcBorders>
+            <w:vAlign w:val="top"/>
+          </w:tcPr>
+          <w:p>
+            <w:pPr>
+              <w:pStyle w:val="TableContents"/>
+              <w:keepNext w:val="false"/>
+              <w:pageBreakBefore w:val="false"/>
+              <w:widowControl/>
+              <w:bidi w:val="0"/>
+              <w:spacing w:before="0" w:after="0"/>
+              <w:ind w:hanging="0" w:left="0"/>
+              <w:jc w:val="left"/>
+              <w:rPr>
+                <w:rFonts w:eastAsia="Arial" w:cs="Arial" w:ascii="Arial" w:hAnsi="Arial"/>
+                <w:b w:val="false"/>
+                <w:i w:val="false"/>
+                <w:color w:val="auto"/>
+                <w:spacing w:val="0"/>
+                <w:w w:val="100"/>
+                <w:sz w:val="16"/>
+                <w:szCs w:val="16"/>
+                <w:lang w:val="ro-RO"/>
+              </w:rPr>
+            </w:pPr>
+            <w:sdt>
+              <w:sdtPr>
+                <w:rPr>
+                  <w:rFonts w:eastAsia="Arial" w:cs="Arial" w:ascii="Arial" w:hAnsi="Arial"/>
+                  <w:b w:val="false"/>
+                  <w:i w:val="false"/>
+                  <w:color w:val="auto"/>
+                  <w:spacing w:val="0"/>
+                  <w:w w:val="100"/>
+                  <w:sz w:val="16"/>
+                  <w:szCs w:val="16"/>
+                  <w:lang w:val="ro-RO"/>
+                </w:rPr>
+                <w:alias w:val="t4_material"/>
+                <w:tag w:val="t4_material"/>
+                <w:id w:val="313"/>
+                <w:showingPlcHdr/>
+                <w:text w:multiLine="1"/>
+              </w:sdtPr>
+              <w:sdtContent>
+                <w:r>
+                  <w:rPr>
+                    <w:rFonts w:eastAsia="Arial" w:cs="Arial" w:ascii="Arial" w:hAnsi="Arial"/>
+                    <w:b w:val="false"/>
+                    <w:i w:val="false"/>
+                    <w:color w:val="auto"/>
+                    <w:spacing w:val="0"/>
+                    <w:w w:val="100"/>
+                    <w:sz w:val="16"/>
+                    <w:szCs w:val="16"/>
+                    <w:lang w:val="ro-RO"/>
+                  </w:rPr>
+                  <w:t xml:space="preserve">                                               </w:t>
+                </w:r>
+                <w:r>
+                  <w:rPr>
+                    <w:rFonts w:eastAsia="Arial" w:cs="Arial" w:ascii="Arial" w:hAnsi="Arial"/>
+                    <w:b w:val="false"/>
+                    <w:i w:val="false"/>
+                    <w:color w:val="auto"/>
+                    <w:spacing w:val="0"/>
+                    <w:w w:val="100"/>
+                    <w:sz w:val="16"/>
+                    <w:szCs w:val="16"/>
+                    <w:lang w:val="ro-RO"/>
+                  </w:rPr>
+                  <w:br/>
+                </w:r>
+                <w:r>
+                  <w:rPr>
+                    <w:rFonts w:eastAsia="Arial" w:cs="Arial" w:ascii="Arial" w:hAnsi="Arial"/>
+                    <w:b w:val="false"/>
+                    <w:i w:val="false"/>
+                    <w:color w:val="auto"/>
+                    <w:spacing w:val="0"/>
+                    <w:w w:val="100"/>
+                    <w:sz w:val="16"/>
+                    <w:szCs w:val="16"/>
+                    <w:lang w:val="ro-RO"/>
+                  </w:rPr>
+                  <w:t xml:space="preserve">                                               </w:t>
+                </w:r>
+                <w:r>
+                  <w:rPr>
+                    <w:rFonts w:eastAsia="Arial" w:cs="Arial" w:ascii="Arial" w:hAnsi="Arial"/>
+                    <w:b w:val="false"/>
+                    <w:i w:val="false"/>
+                    <w:color w:val="auto"/>
+                    <w:spacing w:val="0"/>
+                    <w:w w:val="100"/>
+                    <w:sz w:val="16"/>
+                    <w:szCs w:val="16"/>
+                    <w:lang w:val="ro-RO"/>
+                  </w:rPr>
+                  <w:br/>
+                </w:r>
+                <w:r>
+                  <w:rPr>
+                    <w:rFonts w:eastAsia="Arial" w:cs="Arial" w:ascii="Arial" w:hAnsi="Arial"/>
+                    <w:b w:val="false"/>
+                    <w:i w:val="false"/>
+                    <w:color w:val="auto"/>
+                    <w:spacing w:val="0"/>
+                    <w:w w:val="100"/>
+                    <w:sz w:val="16"/>
+                    <w:szCs w:val="16"/>
+                    <w:lang w:val="ro-RO"/>
+                  </w:rPr>
+                  <w:t xml:space="preserve">                                               </w:t>
+                </w:r>
+              </w:sdtContent>
+            </w:sdt>
+          </w:p>
+        </w:tc>
+        <w:tc>
+          <w:tcPr>
+            <w:tcW w:w="1700" w:type="dxa"/>
+            <w:tcBorders>
+              <w:top w:val="single" w:sz="4" w:space="0" w:color="000000"/>
+              <w:left w:val="single" w:sz="4" w:space="0" w:color="000000"/>
+              <w:bottom w:val="single" w:sz="4" w:space="0" w:color="000000"/>
+              <w:right w:val="single" w:sz="4" w:space="0" w:color="000000"/>
+            </w:tcBorders>
+            <w:vAlign w:val="top"/>
+          </w:tcPr>
+          <w:p>
+            <w:pPr>
+              <w:pStyle w:val="TableContents"/>
+              <w:keepNext w:val="false"/>
+              <w:pageBreakBefore w:val="false"/>
+              <w:widowControl/>
+              <w:bidi w:val="0"/>
+              <w:spacing w:before="0" w:after="0"/>
+              <w:ind w:hanging="0" w:left="0"/>
+              <w:jc w:val="left"/>
+              <w:rPr>
+                <w:rFonts w:eastAsia="Arial" w:cs="Arial" w:ascii="Arial" w:hAnsi="Arial"/>
+                <w:b w:val="false"/>
+                <w:i w:val="false"/>
+                <w:color w:val="auto"/>
+                <w:spacing w:val="0"/>
+                <w:w w:val="100"/>
+                <w:sz w:val="16"/>
+                <w:szCs w:val="16"/>
+                <w:lang w:val="ro-RO"/>
+              </w:rPr>
+            </w:pPr>
+            <w:sdt>
+              <w:sdtPr>
+                <w:rPr>
+                  <w:rFonts w:eastAsia="Arial" w:cs="Arial" w:ascii="Arial" w:hAnsi="Arial"/>
+                  <w:b w:val="false"/>
+                  <w:i w:val="false"/>
+                  <w:color w:val="auto"/>
+                  <w:spacing w:val="0"/>
+                  <w:w w:val="100"/>
+                  <w:sz w:val="16"/>
+                  <w:szCs w:val="16"/>
+                  <w:lang w:val="ro-RO"/>
+                </w:rPr>
+                <w:alias w:val="t4_grade"/>
+                <w:tag w:val="t4_grade"/>
+                <w:id w:val="314"/>
+                <w:showingPlcHdr/>
+                <w:text/>
+              </w:sdtPr>
+              <w:sdtContent>
+                <w:r>
+                  <w:rPr>
+                    <w:rFonts w:eastAsia="Arial" w:cs="Arial" w:ascii="Arial" w:hAnsi="Arial"/>
+                    <w:b w:val="false"/>
+                    <w:i w:val="false"/>
+                    <w:color w:val="auto"/>
+                    <w:spacing w:val="0"/>
+                    <w:w w:val="100"/>
+                    <w:sz w:val="16"/>
+                    <w:szCs w:val="16"/>
+                    <w:lang w:val="ro-RO"/>
+                  </w:rPr>
+                  <w:t xml:space="preserve">                   </w:t>
+                </w:r>
+              </w:sdtContent>
+            </w:sdt>
+          </w:p>
+        </w:tc>
+        <w:tc>
+          <w:tcPr>
+            <w:tcW w:w="2200" w:type="dxa"/>
+            <w:tcBorders>
+              <w:top w:val="single" w:sz="4" w:space="0" w:color="000000"/>
+              <w:left w:val="single" w:sz="4" w:space="0" w:color="000000"/>
+              <w:bottom w:val="single" w:sz="4" w:space="0" w:color="000000"/>
+              <w:right w:val="single" w:sz="4" w:space="0" w:color="000000"/>
+            </w:tcBorders>
+            <w:vAlign w:val="top"/>
+          </w:tcPr>
+          <w:p>
+            <w:pPr>
+              <w:pStyle w:val="TableContents"/>
+              <w:keepNext w:val="false"/>
+              <w:pageBreakBefore w:val="false"/>
+              <w:widowControl/>
+              <w:bidi w:val="0"/>
+              <w:spacing w:before="0" w:after="0"/>
+              <w:ind w:hanging="0" w:left="0"/>
+              <w:jc w:val="left"/>
+              <w:rPr>
+                <w:rFonts w:eastAsia="Arial" w:cs="Arial" w:ascii="Arial" w:hAnsi="Arial"/>
+                <w:b w:val="false"/>
+                <w:i w:val="false"/>
+                <w:color w:val="auto"/>
+                <w:spacing w:val="0"/>
+                <w:w w:val="100"/>
+                <w:sz w:val="16"/>
+                <w:szCs w:val="16"/>
+                <w:lang w:val="ro-RO"/>
+              </w:rPr>
+            </w:pPr>
+            <w:sdt>
+              <w:sdtPr>
+                <w:rPr>
+                  <w:rFonts w:eastAsia="Arial" w:cs="Arial" w:ascii="Arial" w:hAnsi="Arial"/>
+                  <w:b w:val="false"/>
+                  <w:i w:val="false"/>
+                  <w:color w:val="auto"/>
+                  <w:spacing w:val="0"/>
+                  <w:w w:val="100"/>
+                  <w:sz w:val="16"/>
+                  <w:szCs w:val="16"/>
+                  <w:lang w:val="ro-RO"/>
+                </w:rPr>
+                <w:alias w:val="t4_examiner"/>
+                <w:tag w:val="t4_examiner"/>
+                <w:id w:val="315"/>
+                <w:showingPlcHdr/>
+                <w:text w:multiLine="1"/>
+              </w:sdtPr>
+              <w:sdtContent>
+                <w:r>
+                  <w:rPr>
+                    <w:rFonts w:eastAsia="Arial" w:cs="Arial" w:ascii="Arial" w:hAnsi="Arial"/>
+                    <w:b w:val="false"/>
+                    <w:i w:val="false"/>
+                    <w:color w:val="auto"/>
+                    <w:spacing w:val="0"/>
+                    <w:w w:val="100"/>
+                    <w:sz w:val="16"/>
+                    <w:szCs w:val="16"/>
+                    <w:lang w:val="ro-RO"/>
+                  </w:rPr>
+                  <w:t xml:space="preserve">                         </w:t>
+                </w:r>
+                <w:r>
+                  <w:rPr>
+                    <w:rFonts w:eastAsia="Arial" w:cs="Arial" w:ascii="Arial" w:hAnsi="Arial"/>
+                    <w:b w:val="false"/>
+                    <w:i w:val="false"/>
+                    <w:color w:val="auto"/>
+                    <w:spacing w:val="0"/>
+                    <w:w w:val="100"/>
+                    <w:sz w:val="16"/>
+                    <w:szCs w:val="16"/>
+                    <w:lang w:val="ro-RO"/>
+                  </w:rPr>
+                  <w:br/>
+                </w:r>
+                <w:r>
+                  <w:rPr>
+                    <w:rFonts w:eastAsia="Arial" w:cs="Arial" w:ascii="Arial" w:hAnsi="Arial"/>
+                    <w:b w:val="false"/>
+                    <w:i w:val="false"/>
+                    <w:color w:val="auto"/>
+                    <w:spacing w:val="0"/>
+                    <w:w w:val="100"/>
+                    <w:sz w:val="16"/>
+                    <w:szCs w:val="16"/>
+                    <w:lang w:val="ro-RO"/>
+                  </w:rPr>
+                  <w:t xml:space="preserve">                         </w:t>
+                </w:r>
+              </w:sdtContent>
+            </w:sdt>
+            <w:r>
+              <w:rPr>
+                <w:rFonts w:eastAsia="Arial" w:cs="Arial" w:ascii="Arial" w:hAnsi="Arial"/>
+                <w:b w:val="false"/>
+                <w:i w:val="false"/>
+                <w:color w:val="auto"/>
+                <w:spacing w:val="0"/>
+                <w:w w:val="100"/>
+                <w:sz w:val="16"/>
+                <w:szCs w:val="16"/>
+                <w:lang w:val="ro-RO"/>
+              </w:rPr>
+              <w:t xml:space="preserve">{{/form.rows.t4}}</w:t>
+            </w:r>
+          </w:p>
+        </w:tc>
+      </w:tr>
+      <w:tr>
+        <w:trPr>
+          <w:cantSplit/>
+          <w:trHeight w:val="680" w:hRule="atLeast"/>
+        </w:trPr>
+        <w:tc>
+          <w:tcPr>
+            <w:tcW w:w="1500" w:type="dxa"/>
+            <w:tcBorders>
+              <w:top w:val="single" w:sz="4" w:space="0" w:color="000000"/>
+              <w:left w:val="single" w:sz="4" w:space="0" w:color="000000"/>
+              <w:bottom w:val="single" w:sz="4" w:space="0" w:color="000000"/>
+              <w:right w:val="single" w:sz="4" w:space="0" w:color="000000"/>
+            </w:tcBorders>
+            <w:vAlign w:val="top"/>
+          </w:tcPr>
+          <w:p>
+            <w:pPr>
+              <w:pStyle w:val="TableContents"/>
+              <w:keepNext w:val="false"/>
+              <w:pageBreakBefore w:val="false"/>
+              <w:widowControl/>
+              <w:bidi w:val="0"/>
+              <w:spacing w:before="0" w:after="0"/>
+              <w:ind w:hanging="0" w:left="0"/>
+              <w:jc w:val="left"/>
+              <w:rPr>
+                <w:rFonts w:eastAsia="Arial" w:cs="Arial" w:ascii="Arial" w:hAnsi="Arial"/>
+                <w:b w:val="false"/>
+                <w:i w:val="false"/>
+                <w:color w:val="auto"/>
+                <w:spacing w:val="0"/>
+                <w:w w:val="100"/>
+                <w:sz w:val="16"/>
+                <w:szCs w:val="16"/>
+                <w:lang w:val="ro-RO"/>
+              </w:rPr>
+            </w:pPr>
+            <w:r>
+              <w:rPr>
+                <w:rFonts w:eastAsia="Arial" w:cs="Arial" w:ascii="Arial" w:hAnsi="Arial"/>
+                <w:b w:val="false"/>
+                <w:i w:val="false"/>
+                <w:color w:val="auto"/>
+                <w:spacing w:val="0"/>
+                <w:w w:val="100"/>
+                <w:sz w:val="16"/>
+                <w:szCs w:val="16"/>
+                <w:lang w:val="ro-RO"/>
+              </w:rPr>
+              <w:t xml:space="preserve">{{#form.rows.t5}}</w:t>
+            </w:r>
+            <w:sdt>
+              <w:sdtPr>
+                <w:rPr>
+                  <w:rFonts w:eastAsia="Arial" w:cs="Arial" w:ascii="Arial" w:hAnsi="Arial"/>
+                  <w:b w:val="false"/>
+                  <w:i w:val="false"/>
+                  <w:color w:val="auto"/>
+                  <w:spacing w:val="0"/>
+                  <w:w w:val="100"/>
+                  <w:sz w:val="16"/>
+                  <w:szCs w:val="16"/>
+                  <w:lang w:val="ro-RO"/>
+                </w:rPr>
+                <w:alias w:val="t5_date"/>
+                <w:tag w:val="t5_date"/>
+                <w:id w:val="316"/>
+                <w:showingPlcHdr/>
+                <w:text/>
+              </w:sdtPr>
+              <w:sdtContent>
+                <w:r>
+                  <w:rPr>
+                    <w:rFonts w:eastAsia="Arial" w:cs="Arial" w:ascii="Arial" w:hAnsi="Arial"/>
+                    <w:b w:val="false"/>
+                    <w:i w:val="false"/>
+                    <w:color w:val="auto"/>
+                    <w:spacing w:val="0"/>
+                    <w:w w:val="100"/>
+                    <w:sz w:val="16"/>
+                    <w:szCs w:val="16"/>
+                    <w:lang w:val="ro-RO"/>
+                  </w:rPr>
+                  <w:t xml:space="preserve">                </w:t>
+                </w:r>
+              </w:sdtContent>
+            </w:sdt>
+          </w:p>
+          <w:p>
+            <w:pPr>
+              <w:pStyle w:val="TableContents"/>
+              <w:keepNext w:val="false"/>
+              <w:pageBreakBefore w:val="false"/>
+              <w:widowControl/>
+              <w:bidi w:val="0"/>
+              <w:spacing w:before="0" w:after="0"/>
+              <w:ind w:hanging="0" w:left="0"/>
+              <w:jc w:val="left"/>
+              <w:rPr>
+                <w:rFonts w:eastAsia="Arial" w:cs="Arial" w:ascii="Arial" w:hAnsi="Arial"/>
+                <w:b w:val="false"/>
+                <w:i w:val="false"/>
+                <w:color w:val="auto"/>
+                <w:spacing w:val="0"/>
+                <w:w w:val="100"/>
+                <w:sz w:val="16"/>
+                <w:szCs w:val="16"/>
+                <w:lang w:val="ro-RO"/>
+              </w:rPr>
+            </w:pPr>
+            <w:sdt>
+              <w:sdtPr>
+                <w:rPr>
+                  <w:rFonts w:eastAsia="Arial" w:cs="Arial" w:ascii="Arial" w:hAnsi="Arial"/>
+                  <w:b w:val="false"/>
+                  <w:i w:val="false"/>
+                  <w:color w:val="auto"/>
+                  <w:spacing w:val="0"/>
+                  <w:w w:val="100"/>
+                  <w:sz w:val="16"/>
+                  <w:szCs w:val="16"/>
+                  <w:lang w:val="ro-RO"/>
+                </w:rPr>
+                <w:alias w:val="t5_note"/>
+                <w:tag w:val="t5_note"/>
+                <w:id w:val="317"/>
+                <w:showingPlcHdr/>
+                <w:text/>
+              </w:sdtPr>
+              <w:sdtContent>
+                <w:r>
+                  <w:rPr>
+                    <w:rFonts w:eastAsia="Arial" w:cs="Arial" w:ascii="Arial" w:hAnsi="Arial"/>
+                    <w:b w:val="false"/>
+                    <w:i w:val="false"/>
+                    <w:color w:val="auto"/>
+                    <w:spacing w:val="0"/>
+                    <w:w w:val="100"/>
+                    <w:sz w:val="16"/>
+                    <w:szCs w:val="16"/>
+                    <w:lang w:val="ro-RO"/>
+                  </w:rPr>
+                  <w:t xml:space="preserve">                </w:t>
+                </w:r>
+              </w:sdtContent>
+            </w:sdt>
+          </w:p>
+        </w:tc>
+        <w:tc>
+          <w:tcPr>
+            <w:tcW w:w="3955" w:type="dxa"/>
+            <w:tcBorders>
+              <w:top w:val="single" w:sz="4" w:space="0" w:color="000000"/>
+              <w:left w:val="single" w:sz="4" w:space="0" w:color="000000"/>
+              <w:bottom w:val="single" w:sz="4" w:space="0" w:color="000000"/>
+              <w:right w:val="single" w:sz="4" w:space="0" w:color="000000"/>
+            </w:tcBorders>
+            <w:vAlign w:val="top"/>
+          </w:tcPr>
+          <w:p>
+            <w:pPr>
+              <w:pStyle w:val="TableContents"/>
+              <w:keepNext w:val="false"/>
+              <w:pageBreakBefore w:val="false"/>
+              <w:widowControl/>
+              <w:bidi w:val="0"/>
+              <w:spacing w:before="0" w:after="0"/>
+              <w:ind w:hanging="0" w:left="0"/>
+              <w:jc w:val="left"/>
+              <w:rPr>
+                <w:rFonts w:eastAsia="Arial" w:cs="Arial" w:ascii="Arial" w:hAnsi="Arial"/>
+                <w:b w:val="false"/>
+                <w:i w:val="false"/>
+                <w:color w:val="auto"/>
+                <w:spacing w:val="0"/>
+                <w:w w:val="100"/>
+                <w:sz w:val="16"/>
+                <w:szCs w:val="16"/>
+                <w:lang w:val="ro-RO"/>
+              </w:rPr>
+            </w:pPr>
+            <w:sdt>
+              <w:sdtPr>
+                <w:rPr>
+                  <w:rFonts w:eastAsia="Arial" w:cs="Arial" w:ascii="Arial" w:hAnsi="Arial"/>
+                  <w:b w:val="false"/>
+                  <w:i w:val="false"/>
+                  <w:color w:val="auto"/>
+                  <w:spacing w:val="0"/>
+                  <w:w w:val="100"/>
+                  <w:sz w:val="16"/>
+                  <w:szCs w:val="16"/>
+                  <w:lang w:val="ro-RO"/>
+                </w:rPr>
+                <w:alias w:val="t5_material"/>
+                <w:tag w:val="t5_material"/>
+                <w:id w:val="318"/>
+                <w:showingPlcHdr/>
+                <w:text w:multiLine="1"/>
+              </w:sdtPr>
+              <w:sdtContent>
+                <w:r>
+                  <w:rPr>
+                    <w:rFonts w:eastAsia="Arial" w:cs="Arial" w:ascii="Arial" w:hAnsi="Arial"/>
+                    <w:b w:val="false"/>
+                    <w:i w:val="false"/>
+                    <w:color w:val="auto"/>
+                    <w:spacing w:val="0"/>
+                    <w:w w:val="100"/>
+                    <w:sz w:val="16"/>
+                    <w:szCs w:val="16"/>
+                    <w:lang w:val="ro-RO"/>
+                  </w:rPr>
+                  <w:t xml:space="preserve">                                               </w:t>
+                </w:r>
+                <w:r>
+                  <w:rPr>
+                    <w:rFonts w:eastAsia="Arial" w:cs="Arial" w:ascii="Arial" w:hAnsi="Arial"/>
+                    <w:b w:val="false"/>
+                    <w:i w:val="false"/>
+                    <w:color w:val="auto"/>
+                    <w:spacing w:val="0"/>
+                    <w:w w:val="100"/>
+                    <w:sz w:val="16"/>
+                    <w:szCs w:val="16"/>
+                    <w:lang w:val="ro-RO"/>
+                  </w:rPr>
+                  <w:br/>
+                </w:r>
+                <w:r>
+                  <w:rPr>
+                    <w:rFonts w:eastAsia="Arial" w:cs="Arial" w:ascii="Arial" w:hAnsi="Arial"/>
+                    <w:b w:val="false"/>
+                    <w:i w:val="false"/>
+                    <w:color w:val="auto"/>
+                    <w:spacing w:val="0"/>
+                    <w:w w:val="100"/>
+                    <w:sz w:val="16"/>
+                    <w:szCs w:val="16"/>
+                    <w:lang w:val="ro-RO"/>
+                  </w:rPr>
+                  <w:t xml:space="preserve">                                               </w:t>
+                </w:r>
+                <w:r>
+                  <w:rPr>
+                    <w:rFonts w:eastAsia="Arial" w:cs="Arial" w:ascii="Arial" w:hAnsi="Arial"/>
+                    <w:b w:val="false"/>
+                    <w:i w:val="false"/>
+                    <w:color w:val="auto"/>
+                    <w:spacing w:val="0"/>
+                    <w:w w:val="100"/>
+                    <w:sz w:val="16"/>
+                    <w:szCs w:val="16"/>
+                    <w:lang w:val="ro-RO"/>
+                  </w:rPr>
+                  <w:br/>
+                </w:r>
+                <w:r>
+                  <w:rPr>
+                    <w:rFonts w:eastAsia="Arial" w:cs="Arial" w:ascii="Arial" w:hAnsi="Arial"/>
+                    <w:b w:val="false"/>
+                    <w:i w:val="false"/>
+                    <w:color w:val="auto"/>
+                    <w:spacing w:val="0"/>
+                    <w:w w:val="100"/>
+                    <w:sz w:val="16"/>
+                    <w:szCs w:val="16"/>
+                    <w:lang w:val="ro-RO"/>
+                  </w:rPr>
+                  <w:t xml:space="preserve">                                               </w:t>
+                </w:r>
+              </w:sdtContent>
+            </w:sdt>
+          </w:p>
+        </w:tc>
+        <w:tc>
+          <w:tcPr>
+            <w:tcW w:w="1700" w:type="dxa"/>
+            <w:tcBorders>
+              <w:top w:val="single" w:sz="4" w:space="0" w:color="000000"/>
+              <w:left w:val="single" w:sz="4" w:space="0" w:color="000000"/>
+              <w:bottom w:val="single" w:sz="4" w:space="0" w:color="000000"/>
+              <w:right w:val="single" w:sz="4" w:space="0" w:color="000000"/>
+            </w:tcBorders>
+            <w:vAlign w:val="top"/>
+          </w:tcPr>
+          <w:p>
+            <w:pPr>
+              <w:pStyle w:val="TableContents"/>
+              <w:keepNext w:val="false"/>
+              <w:pageBreakBefore w:val="false"/>
+              <w:widowControl/>
+              <w:bidi w:val="0"/>
+              <w:spacing w:before="0" w:after="0"/>
+              <w:ind w:hanging="0" w:left="0"/>
+              <w:jc w:val="left"/>
+              <w:rPr>
+                <w:rFonts w:eastAsia="Arial" w:cs="Arial" w:ascii="Arial" w:hAnsi="Arial"/>
+                <w:b w:val="false"/>
+                <w:i w:val="false"/>
+                <w:color w:val="auto"/>
+                <w:spacing w:val="0"/>
+                <w:w w:val="100"/>
+                <w:sz w:val="16"/>
+                <w:szCs w:val="16"/>
+                <w:lang w:val="ro-RO"/>
+              </w:rPr>
+            </w:pPr>
+            <w:sdt>
+              <w:sdtPr>
+                <w:rPr>
+                  <w:rFonts w:eastAsia="Arial" w:cs="Arial" w:ascii="Arial" w:hAnsi="Arial"/>
+                  <w:b w:val="false"/>
+                  <w:i w:val="false"/>
+                  <w:color w:val="auto"/>
+                  <w:spacing w:val="0"/>
+                  <w:w w:val="100"/>
+                  <w:sz w:val="16"/>
+                  <w:szCs w:val="16"/>
+                  <w:lang w:val="ro-RO"/>
+                </w:rPr>
+                <w:alias w:val="t5_grade"/>
+                <w:tag w:val="t5_grade"/>
+                <w:id w:val="319"/>
+                <w:showingPlcHdr/>
+                <w:text/>
+              </w:sdtPr>
+              <w:sdtContent>
+                <w:r>
+                  <w:rPr>
+                    <w:rFonts w:eastAsia="Arial" w:cs="Arial" w:ascii="Arial" w:hAnsi="Arial"/>
+                    <w:b w:val="false"/>
+                    <w:i w:val="false"/>
+                    <w:color w:val="auto"/>
+                    <w:spacing w:val="0"/>
+                    <w:w w:val="100"/>
+                    <w:sz w:val="16"/>
+                    <w:szCs w:val="16"/>
+                    <w:lang w:val="ro-RO"/>
+                  </w:rPr>
+                  <w:t xml:space="preserve">                   </w:t>
+                </w:r>
+              </w:sdtContent>
+            </w:sdt>
+          </w:p>
+        </w:tc>
+        <w:tc>
+          <w:tcPr>
+            <w:tcW w:w="2200" w:type="dxa"/>
+            <w:tcBorders>
+              <w:top w:val="single" w:sz="4" w:space="0" w:color="000000"/>
+              <w:left w:val="single" w:sz="4" w:space="0" w:color="000000"/>
+              <w:bottom w:val="single" w:sz="4" w:space="0" w:color="000000"/>
+              <w:right w:val="single" w:sz="4" w:space="0" w:color="000000"/>
+            </w:tcBorders>
+            <w:vAlign w:val="top"/>
+          </w:tcPr>
+          <w:p>
+            <w:pPr>
+              <w:pStyle w:val="TableContents"/>
+              <w:keepNext w:val="false"/>
+              <w:pageBreakBefore w:val="false"/>
+              <w:widowControl/>
+              <w:bidi w:val="0"/>
+              <w:spacing w:before="0" w:after="0"/>
+              <w:ind w:hanging="0" w:left="0"/>
+              <w:jc w:val="left"/>
+              <w:rPr>
+                <w:rFonts w:eastAsia="Arial" w:cs="Arial" w:ascii="Arial" w:hAnsi="Arial"/>
+                <w:b w:val="false"/>
+                <w:i w:val="false"/>
+                <w:color w:val="auto"/>
+                <w:spacing w:val="0"/>
+                <w:w w:val="100"/>
+                <w:sz w:val="16"/>
+                <w:szCs w:val="16"/>
+                <w:lang w:val="ro-RO"/>
+              </w:rPr>
+            </w:pPr>
+            <w:sdt>
+              <w:sdtPr>
+                <w:rPr>
+                  <w:rFonts w:eastAsia="Arial" w:cs="Arial" w:ascii="Arial" w:hAnsi="Arial"/>
+                  <w:b w:val="false"/>
+                  <w:i w:val="false"/>
+                  <w:color w:val="auto"/>
+                  <w:spacing w:val="0"/>
+                  <w:w w:val="100"/>
+                  <w:sz w:val="16"/>
+                  <w:szCs w:val="16"/>
+                  <w:lang w:val="ro-RO"/>
+                </w:rPr>
+                <w:alias w:val="t5_examiner"/>
+                <w:tag w:val="t5_examiner"/>
+                <w:id w:val="320"/>
+                <w:showingPlcHdr/>
+                <w:text w:multiLine="1"/>
+              </w:sdtPr>
+              <w:sdtContent>
+                <w:r>
+                  <w:rPr>
+                    <w:rFonts w:eastAsia="Arial" w:cs="Arial" w:ascii="Arial" w:hAnsi="Arial"/>
+                    <w:b w:val="false"/>
+                    <w:i w:val="false"/>
+                    <w:color w:val="auto"/>
+                    <w:spacing w:val="0"/>
+                    <w:w w:val="100"/>
+                    <w:sz w:val="16"/>
+                    <w:szCs w:val="16"/>
+                    <w:lang w:val="ro-RO"/>
+                  </w:rPr>
+                  <w:t xml:space="preserve">                         </w:t>
+                </w:r>
+                <w:r>
+                  <w:rPr>
+                    <w:rFonts w:eastAsia="Arial" w:cs="Arial" w:ascii="Arial" w:hAnsi="Arial"/>
+                    <w:b w:val="false"/>
+                    <w:i w:val="false"/>
+                    <w:color w:val="auto"/>
+                    <w:spacing w:val="0"/>
+                    <w:w w:val="100"/>
+                    <w:sz w:val="16"/>
+                    <w:szCs w:val="16"/>
+                    <w:lang w:val="ro-RO"/>
+                  </w:rPr>
+                  <w:br/>
+                </w:r>
+                <w:r>
+                  <w:rPr>
+                    <w:rFonts w:eastAsia="Arial" w:cs="Arial" w:ascii="Arial" w:hAnsi="Arial"/>
+                    <w:b w:val="false"/>
+                    <w:i w:val="false"/>
+                    <w:color w:val="auto"/>
+                    <w:spacing w:val="0"/>
+                    <w:w w:val="100"/>
+                    <w:sz w:val="16"/>
+                    <w:szCs w:val="16"/>
+                    <w:lang w:val="ro-RO"/>
+                  </w:rPr>
+                  <w:t xml:space="preserve">                         </w:t>
+                </w:r>
+              </w:sdtContent>
+            </w:sdt>
+            <w:r>
+              <w:rPr>
+                <w:rFonts w:eastAsia="Arial" w:cs="Arial" w:ascii="Arial" w:hAnsi="Arial"/>
+                <w:b w:val="false"/>
+                <w:i w:val="false"/>
+                <w:color w:val="auto"/>
+                <w:spacing w:val="0"/>
+                <w:w w:val="100"/>
+                <w:sz w:val="16"/>
+                <w:szCs w:val="16"/>
+                <w:lang w:val="ro-RO"/>
+              </w:rPr>
+              <w:t xml:space="preserve">{{/form.rows.t5}}</w:t>
+            </w:r>
           </w:p>
         </w:tc>
       </w:tr>
     </w:tbl>
+    <w:p>
+      <w:pPr>
+        <w:pStyle w:val="Normal"/>
+        <w:keepNext w:val="false"/>
+        <w:pageBreakBefore w:val="false"/>
+        <w:widowControl/>
+        <w:bidi w:val="0"/>
+        <w:spacing w:before="0" w:after="0"/>
+        <w:ind w:hanging="0" w:left="0"/>
+        <w:jc w:val="left"/>
+        <w:rPr>
+          <w:rFonts w:eastAsia="Arial" w:cs="Arial" w:ascii="Arial" w:hAnsi="Arial"/>
+          <w:b w:val="false"/>
+          <w:i w:val="false"/>
+          <w:color w:val="auto"/>
+          <w:spacing w:val="0"/>
+          <w:w w:val="100"/>
+          <w:sz w:val="20"/>
+          <w:szCs w:val="20"/>
+          <w:lang w:val="ro-RO"/>
+        </w:rPr>
+      </w:pPr>
+      <w:r>
+        <w:rPr>
+          <w:rFonts w:eastAsia="Arial" w:cs="Arial" w:ascii="Arial" w:hAnsi="Arial"/>
+          <w:b w:val="false"/>
+          <w:i w:val="false"/>
+          <w:color w:val="auto"/>
+          <w:spacing w:val="0"/>
+          <w:w w:val="100"/>
+          <w:sz w:val="20"/>
+          <w:szCs w:val="20"/>
+          <w:lang w:val="ro-RO"/>
+        </w:rPr>
+        <w:t xml:space="preserve">{{/form.on}}</w:t>
+      </w:r>
+    </w:p>
     <w:p>
       <w:pPr>
         <w:pStyle w:val="Normal"/>

</xml_diff>